<commit_message>
Merged the 2 docs to ensure it includes all the explanations needed
</commit_message>
<xml_diff>
--- a/Cos214_Prac3.docx
+++ b/Cos214_Prac3.docx
@@ -4,79 +4,61 @@
   <w:body>
     <w:p>
       <w:pPr>
-        <w:rPr>
-          <w:rFonts w:ascii="Arial" w:hAnsi="Arial" w:cs="Arial"/>
-          <w:color w:val="000000" w:themeColor="text1"/>
+        <w:pStyle w:val="Heading1"/>
+        <w:rPr>
+          <w:rFonts w:ascii="Arial" w:hAnsi="Arial" w:cs="Arial"/>
+          <w:sz w:val="24"/>
+          <w:szCs w:val="24"/>
           <w:lang w:val="en-US"/>
         </w:rPr>
       </w:pPr>
       <w:r>
         <w:rPr>
           <w:rFonts w:ascii="Arial" w:hAnsi="Arial" w:cs="Arial"/>
-          <w:color w:val="000000" w:themeColor="text1"/>
+          <w:sz w:val="24"/>
+          <w:szCs w:val="24"/>
           <w:lang w:val="en-US"/>
         </w:rPr>
         <w:t>Practical 3:</w:t>
       </w:r>
-    </w:p>
-    <w:p>
-      <w:pPr>
-        <w:rPr>
-          <w:rFonts w:ascii="Arial" w:hAnsi="Arial" w:cs="Arial"/>
-          <w:color w:val="000000" w:themeColor="text1"/>
+      <w:r>
+        <w:rPr>
+          <w:rFonts w:ascii="Arial" w:hAnsi="Arial" w:cs="Arial"/>
+          <w:sz w:val="24"/>
+          <w:szCs w:val="24"/>
           <w:lang w:val="en-US"/>
         </w:rPr>
-      </w:pPr>
-      <w:r>
-        <w:rPr>
-          <w:rFonts w:ascii="Arial" w:hAnsi="Arial" w:cs="Arial"/>
-          <w:color w:val="000000" w:themeColor="text1"/>
+        <w:t xml:space="preserve"> </w:t>
+      </w:r>
+      <w:proofErr w:type="spellStart"/>
+      <w:r>
+        <w:rPr>
+          <w:rFonts w:ascii="Arial" w:hAnsi="Arial" w:cs="Arial"/>
+          <w:sz w:val="24"/>
+          <w:szCs w:val="24"/>
           <w:lang w:val="en-US"/>
         </w:rPr>
-        <w:t>U25044215 – Hannah Diedrick</w:t>
-      </w:r>
-    </w:p>
-    <w:p>
-      <w:pPr>
-        <w:rPr>
-          <w:rFonts w:ascii="Arial" w:hAnsi="Arial" w:cs="Arial"/>
-          <w:color w:val="000000" w:themeColor="text1"/>
+        <w:t>Lenetdag</w:t>
+      </w:r>
+      <w:proofErr w:type="spellEnd"/>
+      <w:r>
+        <w:rPr>
+          <w:rFonts w:ascii="Arial" w:hAnsi="Arial" w:cs="Arial"/>
+          <w:sz w:val="24"/>
+          <w:szCs w:val="24"/>
           <w:lang w:val="en-US"/>
         </w:rPr>
-      </w:pPr>
-      <w:r>
-        <w:rPr>
-          <w:rFonts w:ascii="Arial" w:hAnsi="Arial" w:cs="Arial"/>
-          <w:color w:val="000000" w:themeColor="text1"/>
+        <w:t xml:space="preserve"> </w:t>
+      </w:r>
+      <w:proofErr w:type="spellStart"/>
+      <w:r>
+        <w:rPr>
+          <w:rFonts w:ascii="Arial" w:hAnsi="Arial" w:cs="Arial"/>
+          <w:sz w:val="24"/>
+          <w:szCs w:val="24"/>
           <w:lang w:val="en-US"/>
         </w:rPr>
-        <w:t>U25038967 – Shelby Bodenstein</w:t>
-      </w:r>
-    </w:p>
-    <w:p>
-      <w:pPr>
-        <w:rPr>
-          <w:rFonts w:ascii="Arial" w:hAnsi="Arial" w:cs="Arial"/>
-          <w:color w:val="000000" w:themeColor="text1"/>
-          <w:lang w:val="en-US"/>
-        </w:rPr>
-      </w:pPr>
-      <w:r>
-        <w:rPr>
-          <w:rFonts w:ascii="Arial" w:hAnsi="Arial" w:cs="Arial"/>
-          <w:color w:val="000000" w:themeColor="text1"/>
-          <w:lang w:val="en-US"/>
-        </w:rPr>
-        <w:t xml:space="preserve">U25571878 – Kelly </w:t>
-      </w:r>
-      <w:proofErr w:type="spellStart"/>
-      <w:r>
-        <w:rPr>
-          <w:rFonts w:ascii="Arial" w:hAnsi="Arial" w:cs="Arial"/>
-          <w:color w:val="000000" w:themeColor="text1"/>
-          <w:lang w:val="en-US"/>
-        </w:rPr>
-        <w:t>Redemeyer</w:t>
+        <w:t>EventFlow</w:t>
       </w:r>
       <w:proofErr w:type="spellEnd"/>
     </w:p>
@@ -85,15 +67,26 @@
         <w:rPr>
           <w:rFonts w:ascii="Arial" w:hAnsi="Arial" w:cs="Arial"/>
           <w:color w:val="000000" w:themeColor="text1"/>
+          <w:u w:val="single"/>
           <w:lang w:val="en-US"/>
         </w:rPr>
       </w:pPr>
+      <w:r>
+        <w:rPr>
+          <w:rFonts w:ascii="Arial" w:hAnsi="Arial" w:cs="Arial"/>
+          <w:color w:val="000000" w:themeColor="text1"/>
+          <w:u w:val="single"/>
+          <w:lang w:val="en-US"/>
+        </w:rPr>
+        <w:t>U25044215 – Hannah Diedrick</w:t>
+      </w:r>
     </w:p>
     <w:p>
       <w:pPr>
         <w:rPr>
           <w:rFonts w:ascii="Arial" w:hAnsi="Arial" w:cs="Arial"/>
           <w:color w:val="000000" w:themeColor="text1"/>
+          <w:u w:val="single"/>
           <w:lang w:val="en-US"/>
         </w:rPr>
       </w:pPr>
@@ -101,14 +94,80 @@
         <w:rPr>
           <w:rFonts w:ascii="Arial" w:hAnsi="Arial" w:cs="Arial"/>
           <w:color w:val="000000" w:themeColor="text1"/>
+          <w:u w:val="single"/>
           <w:lang w:val="en-US"/>
         </w:rPr>
+        <w:t>U25038967 – Shelby Bodenstein</w:t>
+      </w:r>
+    </w:p>
+    <w:p>
+      <w:pPr>
+        <w:rPr>
+          <w:rFonts w:ascii="Arial" w:hAnsi="Arial" w:cs="Arial"/>
+          <w:color w:val="000000" w:themeColor="text1"/>
+          <w:u w:val="single"/>
+          <w:lang w:val="en-US"/>
+        </w:rPr>
+      </w:pPr>
+      <w:r>
+        <w:rPr>
+          <w:rFonts w:ascii="Arial" w:hAnsi="Arial" w:cs="Arial"/>
+          <w:color w:val="000000" w:themeColor="text1"/>
+          <w:u w:val="single"/>
+          <w:lang w:val="en-US"/>
+        </w:rPr>
+        <w:t xml:space="preserve">U25571878 – Kelly </w:t>
+      </w:r>
+      <w:proofErr w:type="spellStart"/>
+      <w:r>
+        <w:rPr>
+          <w:rFonts w:ascii="Arial" w:hAnsi="Arial" w:cs="Arial"/>
+          <w:color w:val="000000" w:themeColor="text1"/>
+          <w:u w:val="single"/>
+          <w:lang w:val="en-US"/>
+        </w:rPr>
+        <w:t>Redemeyer</w:t>
+      </w:r>
+      <w:proofErr w:type="spellEnd"/>
+    </w:p>
+    <w:p>
+      <w:pPr>
+        <w:rPr>
+          <w:rFonts w:ascii="Arial" w:hAnsi="Arial" w:cs="Arial"/>
+          <w:color w:val="000000" w:themeColor="text1"/>
+          <w:lang w:val="en-US"/>
+        </w:rPr>
+      </w:pPr>
+    </w:p>
+    <w:p>
+      <w:pPr>
+        <w:rPr>
+          <w:rFonts w:ascii="Arial" w:hAnsi="Arial" w:cs="Arial"/>
+          <w:b/>
+          <w:bCs/>
+          <w:color w:val="000000" w:themeColor="text1"/>
+          <w:u w:val="single"/>
+          <w:lang w:val="en-US"/>
+        </w:rPr>
+      </w:pPr>
+      <w:r>
+        <w:rPr>
+          <w:rFonts w:ascii="Arial" w:hAnsi="Arial" w:cs="Arial"/>
+          <w:b/>
+          <w:bCs/>
+          <w:color w:val="000000" w:themeColor="text1"/>
+          <w:u w:val="single"/>
+          <w:lang w:val="en-US"/>
+        </w:rPr>
         <w:t>Task 1:</w:t>
       </w:r>
       <w:r>
         <w:rPr>
           <w:rFonts w:ascii="Arial" w:hAnsi="Arial" w:cs="Arial"/>
-          <w:color w:val="000000" w:themeColor="text1"/>
+          <w:b/>
+          <w:bCs/>
+          <w:color w:val="000000" w:themeColor="text1"/>
+          <w:u w:val="single"/>
           <w:lang w:val="en-US"/>
         </w:rPr>
         <w:t xml:space="preserve"> (Hannah)</w:t>
@@ -591,19 +650,15 @@
           <w:rFonts w:ascii="Arial" w:eastAsia="Times New Roman" w:hAnsi="Arial" w:cs="Arial"/>
           <w:color w:val="000000" w:themeColor="text1"/>
           <w:kern w:val="0"/>
-          <w:sz w:val="32"/>
-          <w:szCs w:val="32"/>
-          <w:lang w:eastAsia="en-GB"/>
-          <w14:ligatures w14:val="none"/>
-        </w:rPr>
-      </w:pPr>
-      <w:r>
-        <w:rPr>
-          <w:rFonts w:ascii="Arial" w:eastAsia="Times New Roman" w:hAnsi="Arial" w:cs="Arial"/>
-          <w:color w:val="000000" w:themeColor="text1"/>
-          <w:kern w:val="0"/>
-          <w:sz w:val="22"/>
-          <w:szCs w:val="22"/>
+          <w:lang w:eastAsia="en-GB"/>
+          <w14:ligatures w14:val="none"/>
+        </w:rPr>
+      </w:pPr>
+      <w:r>
+        <w:rPr>
+          <w:rFonts w:ascii="Arial" w:eastAsia="Times New Roman" w:hAnsi="Arial" w:cs="Arial"/>
+          <w:color w:val="000000" w:themeColor="text1"/>
+          <w:kern w:val="0"/>
           <w:lang w:eastAsia="en-GB"/>
           <w14:ligatures w14:val="none"/>
         </w:rPr>
@@ -621,8 +676,6 @@
           <w:rFonts w:ascii="Arial" w:eastAsia="Times New Roman" w:hAnsi="Arial" w:cs="Arial"/>
           <w:color w:val="000000" w:themeColor="text1"/>
           <w:kern w:val="0"/>
-          <w:sz w:val="32"/>
-          <w:szCs w:val="32"/>
           <w:lang w:eastAsia="en-GB"/>
           <w14:ligatures w14:val="none"/>
         </w:rPr>
@@ -633,8 +686,6 @@
           <w:rFonts w:ascii="Arial" w:eastAsia="Times New Roman" w:hAnsi="Arial" w:cs="Arial"/>
           <w:color w:val="000000" w:themeColor="text1"/>
           <w:kern w:val="0"/>
-          <w:sz w:val="22"/>
-          <w:szCs w:val="22"/>
           <w:lang w:eastAsia="en-GB"/>
           <w14:ligatures w14:val="none"/>
         </w:rPr>
@@ -653,8 +704,6 @@
           <w:rFonts w:ascii="Arial" w:eastAsia="Times New Roman" w:hAnsi="Arial" w:cs="Arial"/>
           <w:color w:val="000000" w:themeColor="text1"/>
           <w:kern w:val="0"/>
-          <w:sz w:val="32"/>
-          <w:szCs w:val="32"/>
           <w:lang w:eastAsia="en-GB"/>
           <w14:ligatures w14:val="none"/>
         </w:rPr>
@@ -665,8 +714,6 @@
           <w:rFonts w:ascii="Arial" w:eastAsia="Times New Roman" w:hAnsi="Arial" w:cs="Arial"/>
           <w:color w:val="000000" w:themeColor="text1"/>
           <w:kern w:val="0"/>
-          <w:sz w:val="22"/>
-          <w:szCs w:val="22"/>
           <w:lang w:eastAsia="en-GB"/>
           <w14:ligatures w14:val="none"/>
         </w:rPr>
@@ -685,8 +732,6 @@
           <w:rFonts w:ascii="Arial" w:eastAsia="Times New Roman" w:hAnsi="Arial" w:cs="Arial"/>
           <w:color w:val="000000" w:themeColor="text1"/>
           <w:kern w:val="0"/>
-          <w:sz w:val="32"/>
-          <w:szCs w:val="32"/>
           <w:lang w:eastAsia="en-GB"/>
           <w14:ligatures w14:val="none"/>
         </w:rPr>
@@ -697,8 +742,6 @@
           <w:rFonts w:ascii="Arial" w:eastAsia="Times New Roman" w:hAnsi="Arial" w:cs="Arial"/>
           <w:color w:val="000000" w:themeColor="text1"/>
           <w:kern w:val="0"/>
-          <w:sz w:val="22"/>
-          <w:szCs w:val="22"/>
           <w:lang w:eastAsia="en-GB"/>
           <w14:ligatures w14:val="none"/>
         </w:rPr>
@@ -717,8 +760,6 @@
           <w:rFonts w:ascii="Arial" w:eastAsia="Times New Roman" w:hAnsi="Arial" w:cs="Arial"/>
           <w:color w:val="000000" w:themeColor="text1"/>
           <w:kern w:val="0"/>
-          <w:sz w:val="32"/>
-          <w:szCs w:val="32"/>
           <w:lang w:eastAsia="en-GB"/>
           <w14:ligatures w14:val="none"/>
         </w:rPr>
@@ -729,8 +770,6 @@
           <w:rFonts w:ascii="Arial" w:eastAsia="Times New Roman" w:hAnsi="Arial" w:cs="Arial"/>
           <w:color w:val="000000" w:themeColor="text1"/>
           <w:kern w:val="0"/>
-          <w:sz w:val="22"/>
-          <w:szCs w:val="22"/>
           <w:lang w:eastAsia="en-GB"/>
           <w14:ligatures w14:val="none"/>
         </w:rPr>
@@ -749,8 +788,6 @@
           <w:rFonts w:ascii="Arial" w:eastAsia="Times New Roman" w:hAnsi="Arial" w:cs="Arial"/>
           <w:color w:val="000000" w:themeColor="text1"/>
           <w:kern w:val="0"/>
-          <w:sz w:val="32"/>
-          <w:szCs w:val="32"/>
           <w:lang w:eastAsia="en-GB"/>
           <w14:ligatures w14:val="none"/>
         </w:rPr>
@@ -761,8 +798,6 @@
           <w:rFonts w:ascii="Arial" w:eastAsia="Times New Roman" w:hAnsi="Arial" w:cs="Arial"/>
           <w:color w:val="000000" w:themeColor="text1"/>
           <w:kern w:val="0"/>
-          <w:sz w:val="22"/>
-          <w:szCs w:val="22"/>
           <w:lang w:eastAsia="en-GB"/>
           <w14:ligatures w14:val="none"/>
         </w:rPr>
@@ -781,19 +816,15 @@
           <w:rFonts w:ascii="Arial" w:eastAsia="Times New Roman" w:hAnsi="Arial" w:cs="Arial"/>
           <w:color w:val="000000" w:themeColor="text1"/>
           <w:kern w:val="0"/>
-          <w:sz w:val="32"/>
-          <w:szCs w:val="32"/>
-          <w:lang w:eastAsia="en-GB"/>
-          <w14:ligatures w14:val="none"/>
-        </w:rPr>
-      </w:pPr>
-      <w:r>
-        <w:rPr>
-          <w:rFonts w:ascii="Arial" w:eastAsia="Times New Roman" w:hAnsi="Arial" w:cs="Arial"/>
-          <w:color w:val="000000" w:themeColor="text1"/>
-          <w:kern w:val="0"/>
-          <w:sz w:val="22"/>
-          <w:szCs w:val="22"/>
+          <w:lang w:eastAsia="en-GB"/>
+          <w14:ligatures w14:val="none"/>
+        </w:rPr>
+      </w:pPr>
+      <w:r>
+        <w:rPr>
+          <w:rFonts w:ascii="Arial" w:eastAsia="Times New Roman" w:hAnsi="Arial" w:cs="Arial"/>
+          <w:color w:val="000000" w:themeColor="text1"/>
+          <w:kern w:val="0"/>
           <w:lang w:eastAsia="en-GB"/>
           <w14:ligatures w14:val="none"/>
         </w:rPr>
@@ -811,8 +842,6 @@
           <w:rFonts w:ascii="Arial" w:eastAsia="Times New Roman" w:hAnsi="Arial" w:cs="Arial"/>
           <w:color w:val="000000" w:themeColor="text1"/>
           <w:kern w:val="0"/>
-          <w:sz w:val="32"/>
-          <w:szCs w:val="32"/>
           <w:lang w:eastAsia="en-GB"/>
           <w14:ligatures w14:val="none"/>
         </w:rPr>
@@ -823,8 +852,6 @@
           <w:rFonts w:ascii="Arial" w:eastAsia="Times New Roman" w:hAnsi="Arial" w:cs="Arial"/>
           <w:color w:val="000000" w:themeColor="text1"/>
           <w:kern w:val="0"/>
-          <w:sz w:val="22"/>
-          <w:szCs w:val="22"/>
           <w:lang w:eastAsia="en-GB"/>
           <w14:ligatures w14:val="none"/>
         </w:rPr>
@@ -1210,7 +1237,23 @@
           <w:color w:val="000000" w:themeColor="text1"/>
           <w:lang w:val="en-US"/>
         </w:rPr>
-        <w:t>Composite design patter:</w:t>
+        <w:t>Composite design patter</w:t>
+      </w:r>
+      <w:r>
+        <w:rPr>
+          <w:rFonts w:ascii="Arial" w:hAnsi="Arial" w:cs="Arial"/>
+          <w:color w:val="000000" w:themeColor="text1"/>
+          <w:lang w:val="en-US"/>
+        </w:rPr>
+        <w:t>n</w:t>
+      </w:r>
+      <w:r>
+        <w:rPr>
+          <w:rFonts w:ascii="Arial" w:hAnsi="Arial" w:cs="Arial"/>
+          <w:color w:val="000000" w:themeColor="text1"/>
+          <w:lang w:val="en-US"/>
+        </w:rPr>
+        <w:t>:</w:t>
       </w:r>
     </w:p>
     <w:tbl>
@@ -1744,7 +1787,41 @@
           <w:color w:val="000000" w:themeColor="text1"/>
           <w:lang w:val="en-US"/>
         </w:rPr>
-        <w:t>Observer participants:</w:t>
+        <w:br w:type="page"/>
+      </w:r>
+    </w:p>
+    <w:p>
+      <w:pPr>
+        <w:rPr>
+          <w:rFonts w:ascii="Arial" w:hAnsi="Arial" w:cs="Arial"/>
+          <w:color w:val="000000" w:themeColor="text1"/>
+          <w:lang w:val="en-US"/>
+        </w:rPr>
+      </w:pPr>
+      <w:r>
+        <w:rPr>
+          <w:rFonts w:ascii="Arial" w:hAnsi="Arial" w:cs="Arial"/>
+          <w:color w:val="000000" w:themeColor="text1"/>
+          <w:lang w:val="en-US"/>
+        </w:rPr>
+        <w:lastRenderedPageBreak/>
+        <w:t xml:space="preserve">Observer </w:t>
+      </w:r>
+      <w:r>
+        <w:rPr>
+          <w:rFonts w:ascii="Arial" w:hAnsi="Arial" w:cs="Arial"/>
+          <w:color w:val="000000" w:themeColor="text1"/>
+          <w:lang w:val="en-US"/>
+        </w:rPr>
+        <w:t>design pattern</w:t>
+      </w:r>
+      <w:r>
+        <w:rPr>
+          <w:rFonts w:ascii="Arial" w:hAnsi="Arial" w:cs="Arial"/>
+          <w:color w:val="000000" w:themeColor="text1"/>
+          <w:lang w:val="en-US"/>
+        </w:rPr>
+        <w:t>:</w:t>
       </w:r>
     </w:p>
     <w:tbl>
@@ -1845,7 +1922,6 @@
                 <w:color w:val="000000" w:themeColor="text1"/>
                 <w:lang w:val="en-US"/>
               </w:rPr>
-              <w:lastRenderedPageBreak/>
               <w:t>Subject</w:t>
             </w:r>
           </w:p>
@@ -2289,10 +2365,8 @@
     <w:p>
       <w:pPr>
         <w:rPr>
-          <w:rFonts w:ascii="-webkit-standard" w:hAnsi="-webkit-standard"/>
-          <w:color w:val="000000" w:themeColor="text1"/>
-          <w:sz w:val="27"/>
-          <w:szCs w:val="27"/>
+          <w:rFonts w:ascii="Arial" w:hAnsi="Arial" w:cs="Arial"/>
+          <w:color w:val="000000" w:themeColor="text1"/>
         </w:rPr>
       </w:pPr>
       <w:r>
@@ -2601,47 +2675,14 @@
           <w:rFonts w:ascii="Arial" w:hAnsi="Arial" w:cs="Arial"/>
           <w:color w:val="000000" w:themeColor="text1"/>
         </w:rPr>
-        <w:t xml:space="preserve"> </w:t>
-      </w:r>
-      <w:r>
-        <w:rPr>
-          <w:rStyle w:val="apple-converted-space"/>
-          <w:rFonts w:ascii="Arial" w:hAnsi="Arial" w:cs="Arial"/>
-          <w:color w:val="000000" w:themeColor="text1"/>
-        </w:rPr>
-        <w:t>class</w:t>
-      </w:r>
-      <w:r>
-        <w:rPr>
-          <w:rStyle w:val="apple-converted-space"/>
-          <w:rFonts w:ascii="Arial" w:hAnsi="Arial" w:cs="Arial"/>
-          <w:color w:val="000000" w:themeColor="text1"/>
-        </w:rPr>
-        <w:t xml:space="preserve"> </w:t>
-      </w:r>
-      <w:r>
-        <w:rPr>
-          <w:rStyle w:val="apple-converted-space"/>
-          <w:rFonts w:ascii="Arial" w:hAnsi="Arial" w:cs="Arial"/>
-          <w:color w:val="000000" w:themeColor="text1"/>
-        </w:rPr>
-        <w:t>a</w:t>
-      </w:r>
-      <w:r>
-        <w:rPr>
-          <w:rFonts w:ascii="Arial" w:hAnsi="Arial" w:cs="Arial"/>
-          <w:color w:val="000000" w:themeColor="text1"/>
-        </w:rPr>
-        <w:t>bstraction</w:t>
-      </w:r>
-      <w:r>
-        <w:rPr>
-          <w:rFonts w:ascii="-webkit-standard" w:hAnsi="-webkit-standard"/>
-          <w:color w:val="000000" w:themeColor="text1"/>
-          <w:sz w:val="27"/>
-          <w:szCs w:val="27"/>
-        </w:rPr>
-        <w:t>.</w:t>
+        <w:t xml:space="preserve"> class a</w:t>
+      </w:r>
+      <w:r>
+        <w:rPr>
+          <w:rFonts w:ascii="Arial" w:hAnsi="Arial" w:cs="Arial"/>
+          <w:color w:val="000000" w:themeColor="text1"/>
+        </w:rPr>
+        <w:t>bstraction.</w:t>
       </w:r>
     </w:p>
     <w:p>
@@ -2657,15 +2698,7 @@
           <w:color w:val="000000" w:themeColor="text1"/>
           <w:lang w:val="en-US"/>
         </w:rPr>
-        <w:t>b)</w:t>
-      </w:r>
-      <w:r>
-        <w:rPr>
-          <w:rFonts w:ascii="Arial" w:hAnsi="Arial" w:cs="Arial"/>
-          <w:color w:val="000000" w:themeColor="text1"/>
-          <w:lang w:val="en-US"/>
-        </w:rPr>
-        <w:t xml:space="preserve"> </w:t>
+        <w:t xml:space="preserve">b) </w:t>
       </w:r>
       <w:r>
         <w:rPr>
@@ -2907,6 +2940,7 @@
           <w:rFonts w:ascii="Arial" w:hAnsi="Arial" w:cs="Arial"/>
           <w:color w:val="000000" w:themeColor="text1"/>
         </w:rPr>
+        <w:lastRenderedPageBreak/>
         <w:t xml:space="preserve">e) The event group is both a subject and an observer because they each do different roles. </w:t>
       </w:r>
       <w:r>
@@ -2914,15 +2948,7 @@
           <w:rFonts w:ascii="Arial" w:hAnsi="Arial" w:cs="Arial"/>
           <w:color w:val="000000" w:themeColor="text1"/>
         </w:rPr>
-        <w:t xml:space="preserve">As the observer, the event group receives updates from the subject. As the </w:t>
-      </w:r>
-      <w:r>
-        <w:rPr>
-          <w:rFonts w:ascii="Arial" w:hAnsi="Arial" w:cs="Arial"/>
-          <w:color w:val="000000" w:themeColor="text1"/>
-        </w:rPr>
-        <w:lastRenderedPageBreak/>
-        <w:t xml:space="preserve">subject, the event groups sends updates to the relevant classes below it. Therefore the roles complement each other rather than conflict them. </w:t>
+        <w:t xml:space="preserve">As the observer, the event group receives updates from the subject. As the subject, the event groups sends updates to the relevant classes below it. Therefore the roles complement each other rather than conflict them. </w:t>
       </w:r>
     </w:p>
     <w:p>
@@ -2937,25 +2963,21 @@
       <w:pPr>
         <w:rPr>
           <w:rFonts w:ascii="Arial" w:hAnsi="Arial" w:cs="Arial"/>
-          <w:color w:val="000000" w:themeColor="text1"/>
-          <w:lang w:val="en-US"/>
-        </w:rPr>
-      </w:pPr>
-      <w:r>
-        <w:rPr>
-          <w:rFonts w:ascii="Arial" w:hAnsi="Arial" w:cs="Arial"/>
-          <w:color w:val="000000" w:themeColor="text1"/>
-          <w:lang w:val="en-US"/>
-        </w:rPr>
-        <w:t>Task 2:</w:t>
-      </w:r>
-      <w:r>
-        <w:rPr>
-          <w:rFonts w:ascii="Arial" w:hAnsi="Arial" w:cs="Arial"/>
-          <w:color w:val="000000" w:themeColor="text1"/>
-          <w:lang w:val="en-US"/>
-        </w:rPr>
-        <w:t xml:space="preserve"> (Kelly)</w:t>
+          <w:b/>
+          <w:bCs/>
+          <w:color w:val="000000" w:themeColor="text1"/>
+          <w:u w:val="single"/>
+        </w:rPr>
+      </w:pPr>
+      <w:r>
+        <w:rPr>
+          <w:rFonts w:ascii="Arial" w:hAnsi="Arial" w:cs="Arial"/>
+          <w:b/>
+          <w:bCs/>
+          <w:color w:val="000000" w:themeColor="text1"/>
+          <w:u w:val="single"/>
+        </w:rPr>
+        <w:t>Task 2: (Kelly)</w:t>
       </w:r>
     </w:p>
     <w:p>
@@ -2963,126 +2985,993 @@
         <w:rPr>
           <w:rFonts w:ascii="Arial" w:hAnsi="Arial" w:cs="Arial"/>
           <w:color w:val="000000" w:themeColor="text1"/>
-          <w:lang w:val="en-US"/>
-        </w:rPr>
-      </w:pPr>
+        </w:rPr>
+      </w:pPr>
+      <w:r>
+        <w:rPr>
+          <w:rFonts w:ascii="Arial" w:hAnsi="Arial" w:cs="Arial"/>
+          <w:color w:val="000000" w:themeColor="text1"/>
+        </w:rPr>
+        <w:t xml:space="preserve">2.2) </w:t>
+      </w:r>
+      <w:r>
+        <w:rPr>
+          <w:rFonts w:ascii="Arial" w:hAnsi="Arial" w:cs="Arial"/>
+          <w:noProof/>
+          <w:color w:val="000000"/>
+        </w:rPr>
+        <w:drawing>
+          <wp:inline distT="0" distB="0" distL="0" distR="0" wp14:anchorId="686E0B10" wp14:editId="140C19CE">
+            <wp:extent cx="5731510" cy="3559810"/>
+            <wp:effectExtent l="0" t="0" r="0" b="0"/>
+            <wp:docPr id="817147012" name="Picture 1"/>
+            <wp:cNvGraphicFramePr>
+              <a:graphicFrameLocks xmlns:a="http://schemas.openxmlformats.org/drawingml/2006/main" noChangeAspect="1"/>
+            </wp:cNvGraphicFramePr>
+            <a:graphic xmlns:a="http://schemas.openxmlformats.org/drawingml/2006/main">
+              <a:graphicData uri="http://schemas.openxmlformats.org/drawingml/2006/picture">
+                <pic:pic xmlns:pic="http://schemas.openxmlformats.org/drawingml/2006/picture">
+                  <pic:nvPicPr>
+                    <pic:cNvPr id="0" name="Picture 1"/>
+                    <pic:cNvPicPr>
+                      <a:picLocks noChangeAspect="1" noChangeArrowheads="1"/>
+                    </pic:cNvPicPr>
+                  </pic:nvPicPr>
+                  <pic:blipFill>
+                    <a:blip r:embed="rId5" cstate="print">
+                      <a:extLst>
+                        <a:ext uri="{28A0092B-C50C-407E-A947-70E740481C1C}">
+                          <a14:useLocalDpi xmlns:a14="http://schemas.microsoft.com/office/drawing/2010/main" val="0"/>
+                        </a:ext>
+                      </a:extLst>
+                    </a:blip>
+                    <a:srcRect/>
+                    <a:stretch>
+                      <a:fillRect/>
+                    </a:stretch>
+                  </pic:blipFill>
+                  <pic:spPr bwMode="auto">
+                    <a:xfrm>
+                      <a:off x="0" y="0"/>
+                      <a:ext cx="5731510" cy="3559810"/>
+                    </a:xfrm>
+                    <a:prstGeom prst="rect">
+                      <a:avLst/>
+                    </a:prstGeom>
+                    <a:noFill/>
+                    <a:ln>
+                      <a:noFill/>
+                    </a:ln>
+                  </pic:spPr>
+                </pic:pic>
+              </a:graphicData>
+            </a:graphic>
+          </wp:inline>
+        </w:drawing>
+      </w:r>
     </w:p>
     <w:p>
       <w:pPr>
         <w:rPr>
           <w:rFonts w:ascii="Arial" w:hAnsi="Arial" w:cs="Arial"/>
           <w:color w:val="000000" w:themeColor="text1"/>
-          <w:lang w:val="en-US"/>
-        </w:rPr>
-      </w:pPr>
-      <w:r>
-        <w:rPr>
-          <w:rFonts w:ascii="Arial" w:hAnsi="Arial" w:cs="Arial"/>
-          <w:color w:val="000000" w:themeColor="text1"/>
-          <w:lang w:val="en-US"/>
-        </w:rPr>
-        <w:t>Task 3:</w:t>
-      </w:r>
-      <w:r>
-        <w:rPr>
-          <w:rFonts w:ascii="Arial" w:hAnsi="Arial" w:cs="Arial"/>
-          <w:color w:val="000000" w:themeColor="text1"/>
-          <w:lang w:val="en-US"/>
-        </w:rPr>
-        <w:t xml:space="preserve"> (Kelly)</w:t>
-      </w:r>
+        </w:rPr>
+      </w:pPr>
     </w:p>
     <w:p>
       <w:pPr>
         <w:rPr>
           <w:rFonts w:ascii="Arial" w:hAnsi="Arial" w:cs="Arial"/>
-          <w:color w:val="000000" w:themeColor="text1"/>
-          <w:lang w:val="en-US"/>
-        </w:rPr>
-      </w:pPr>
+          <w:b/>
+          <w:bCs/>
+          <w:color w:val="000000" w:themeColor="text1"/>
+          <w:u w:val="single"/>
+        </w:rPr>
+      </w:pPr>
+      <w:r>
+        <w:rPr>
+          <w:rFonts w:ascii="Arial" w:hAnsi="Arial" w:cs="Arial"/>
+          <w:b/>
+          <w:bCs/>
+          <w:color w:val="000000" w:themeColor="text1"/>
+          <w:u w:val="single"/>
+        </w:rPr>
+        <w:t>Task 3: (Kelly)</w:t>
+      </w:r>
     </w:p>
     <w:p>
       <w:pPr>
-        <w:rPr>
-          <w:rFonts w:ascii="Arial" w:hAnsi="Arial" w:cs="Arial"/>
-          <w:color w:val="000000" w:themeColor="text1"/>
-          <w:lang w:val="en-US"/>
-        </w:rPr>
-      </w:pPr>
-      <w:r>
-        <w:rPr>
-          <w:rFonts w:ascii="Arial" w:hAnsi="Arial" w:cs="Arial"/>
-          <w:color w:val="000000" w:themeColor="text1"/>
-          <w:lang w:val="en-US"/>
-        </w:rPr>
-        <w:t>Task 4:</w:t>
-      </w:r>
-      <w:r>
-        <w:rPr>
-          <w:rFonts w:ascii="Arial" w:hAnsi="Arial" w:cs="Arial"/>
-          <w:color w:val="000000" w:themeColor="text1"/>
-          <w:lang w:val="en-US"/>
-        </w:rPr>
-        <w:t xml:space="preserve"> (Kelly)</w:t>
+        <w:pStyle w:val="NormalWeb"/>
+        <w:spacing w:before="0" w:beforeAutospacing="0" w:after="160" w:afterAutospacing="0"/>
+        <w:rPr>
+          <w:rFonts w:ascii="Arial" w:hAnsi="Arial" w:cs="Arial"/>
+          <w:color w:val="000000"/>
+        </w:rPr>
+      </w:pPr>
+      <w:r>
+        <w:rPr>
+          <w:rFonts w:ascii="Arial" w:hAnsi="Arial" w:cs="Arial"/>
+          <w:color w:val="000000" w:themeColor="text1"/>
+        </w:rPr>
+        <w:t xml:space="preserve">3.5) </w:t>
+      </w:r>
+      <w:r>
+        <w:rPr>
+          <w:rFonts w:ascii="Arial" w:hAnsi="Arial" w:cs="Arial"/>
+          <w:color w:val="000000"/>
+        </w:rPr>
+        <w:t xml:space="preserve">For our practical we used push for Observer. This is seen in </w:t>
+      </w:r>
+      <w:proofErr w:type="spellStart"/>
+      <w:r>
+        <w:rPr>
+          <w:rFonts w:ascii="Arial" w:hAnsi="Arial" w:cs="Arial"/>
+          <w:color w:val="000000"/>
+        </w:rPr>
+        <w:t>EventControl</w:t>
+      </w:r>
+      <w:proofErr w:type="spellEnd"/>
+      <w:r>
+        <w:rPr>
+          <w:rFonts w:ascii="Arial" w:hAnsi="Arial" w:cs="Arial"/>
+          <w:color w:val="000000"/>
+        </w:rPr>
+        <w:t xml:space="preserve"> of the function notify(Notice). The passed in parameter is a complete object and is passed in directly into every observer’s update(</w:t>
+      </w:r>
+      <w:proofErr w:type="spellStart"/>
+      <w:r>
+        <w:rPr>
+          <w:rFonts w:ascii="Arial" w:hAnsi="Arial" w:cs="Arial"/>
+          <w:color w:val="000000"/>
+        </w:rPr>
+        <w:t>const</w:t>
+      </w:r>
+      <w:proofErr w:type="spellEnd"/>
+      <w:r>
+        <w:rPr>
+          <w:rFonts w:ascii="Arial" w:hAnsi="Arial" w:cs="Arial"/>
+          <w:color w:val="000000"/>
+        </w:rPr>
+        <w:t xml:space="preserve"> Notice&amp;), everything is arrived in the same call</w:t>
       </w:r>
     </w:p>
     <w:p>
       <w:pPr>
-        <w:rPr>
-          <w:rFonts w:ascii="Arial" w:hAnsi="Arial" w:cs="Arial"/>
-          <w:color w:val="000000" w:themeColor="text1"/>
-          <w:lang w:val="en-US"/>
-        </w:rPr>
-      </w:pPr>
+        <w:spacing w:line="240" w:lineRule="auto"/>
+        <w:rPr>
+          <w:rFonts w:ascii="Arial" w:eastAsia="Times New Roman" w:hAnsi="Arial" w:cs="Arial"/>
+          <w:color w:val="000000"/>
+          <w:kern w:val="0"/>
+          <w:lang w:eastAsia="en-GB"/>
+          <w14:ligatures w14:val="none"/>
+        </w:rPr>
+      </w:pPr>
+      <w:r>
+        <w:rPr>
+          <w:rFonts w:ascii="Arial" w:eastAsia="Times New Roman" w:hAnsi="Arial" w:cs="Arial"/>
+          <w:color w:val="000000"/>
+          <w:kern w:val="0"/>
+          <w:lang w:eastAsia="en-GB"/>
+          <w14:ligatures w14:val="none"/>
+        </w:rPr>
+        <w:t>Push instead of pull: </w:t>
+      </w:r>
     </w:p>
     <w:p>
       <w:pPr>
-        <w:rPr>
-          <w:rFonts w:ascii="Arial" w:hAnsi="Arial" w:cs="Arial"/>
-          <w:color w:val="000000" w:themeColor="text1"/>
-          <w:lang w:val="en-US"/>
-        </w:rPr>
-      </w:pPr>
-      <w:r>
-        <w:rPr>
-          <w:rFonts w:ascii="Arial" w:hAnsi="Arial" w:cs="Arial"/>
-          <w:color w:val="000000" w:themeColor="text1"/>
-          <w:lang w:val="en-US"/>
-        </w:rPr>
-        <w:t>Task 5:</w:t>
-      </w:r>
-      <w:r>
-        <w:rPr>
-          <w:rFonts w:ascii="Arial" w:hAnsi="Arial" w:cs="Arial"/>
-          <w:color w:val="000000" w:themeColor="text1"/>
-          <w:lang w:val="en-US"/>
-        </w:rPr>
-        <w:t xml:space="preserve"> (Shelby)</w:t>
+        <w:spacing w:line="240" w:lineRule="auto"/>
+        <w:rPr>
+          <w:rFonts w:ascii="Arial" w:eastAsia="Times New Roman" w:hAnsi="Arial" w:cs="Arial"/>
+          <w:color w:val="000000"/>
+          <w:kern w:val="0"/>
+          <w:lang w:eastAsia="en-GB"/>
+          <w14:ligatures w14:val="none"/>
+        </w:rPr>
+      </w:pPr>
+      <w:r>
+        <w:rPr>
+          <w:rFonts w:ascii="Arial" w:eastAsia="Times New Roman" w:hAnsi="Arial" w:cs="Arial"/>
+          <w:color w:val="000000"/>
+          <w:kern w:val="0"/>
+          <w:lang w:eastAsia="en-GB"/>
+          <w14:ligatures w14:val="none"/>
+        </w:rPr>
+        <w:t>Pull only signals that there a something is changed. This would mean that each observer would have to call an accessor on the subject to retrieve the details. In the update function it would have to call a separate function to retrieve details to perform the function.</w:t>
       </w:r>
     </w:p>
     <w:p>
       <w:pPr>
         <w:rPr>
-          <w:rFonts w:ascii="Arial" w:hAnsi="Arial" w:cs="Arial"/>
-          <w:color w:val="000000" w:themeColor="text1"/>
-          <w:lang w:val="en-US"/>
-        </w:rPr>
-      </w:pPr>
-      <w:r>
-        <w:rPr>
-          <w:rFonts w:ascii="Arial" w:hAnsi="Arial" w:cs="Arial"/>
-          <w:color w:val="000000" w:themeColor="text1"/>
-          <w:lang w:val="en-US"/>
-        </w:rPr>
-        <w:t>Attached separately.</w:t>
+          <w:rFonts w:ascii="Arial" w:eastAsia="Times New Roman" w:hAnsi="Arial" w:cs="Arial"/>
+          <w:color w:val="000000"/>
+          <w:kern w:val="0"/>
+          <w:lang w:eastAsia="en-GB"/>
+          <w14:ligatures w14:val="none"/>
+        </w:rPr>
+      </w:pPr>
+      <w:r>
+        <w:rPr>
+          <w:rFonts w:ascii="Arial" w:eastAsia="Times New Roman" w:hAnsi="Arial" w:cs="Arial"/>
+          <w:color w:val="000000"/>
+          <w:kern w:val="0"/>
+          <w:lang w:eastAsia="en-GB"/>
+          <w14:ligatures w14:val="none"/>
+        </w:rPr>
+        <w:br w:type="page"/>
       </w:r>
     </w:p>
     <w:p>
       <w:pPr>
-        <w:rPr>
-          <w:rFonts w:ascii="Arial" w:hAnsi="Arial" w:cs="Arial"/>
-          <w:color w:val="000000" w:themeColor="text1"/>
-          <w:lang w:val="en-US"/>
+        <w:spacing w:line="240" w:lineRule="auto"/>
+        <w:rPr>
+          <w:rFonts w:ascii="Arial" w:eastAsia="Times New Roman" w:hAnsi="Arial" w:cs="Arial"/>
+          <w:color w:val="000000"/>
+          <w:kern w:val="0"/>
+          <w:lang w:eastAsia="en-GB"/>
+          <w14:ligatures w14:val="none"/>
+        </w:rPr>
+      </w:pPr>
+    </w:p>
+    <w:tbl>
+      <w:tblPr>
+        <w:tblW w:w="0" w:type="auto"/>
+        <w:tblCellMar>
+          <w:top w:w="15" w:type="dxa"/>
+          <w:left w:w="15" w:type="dxa"/>
+          <w:bottom w:w="15" w:type="dxa"/>
+          <w:right w:w="15" w:type="dxa"/>
+        </w:tblCellMar>
+        <w:tblLook w:val="04A0" w:firstRow="1" w:lastRow="0" w:firstColumn="1" w:lastColumn="0" w:noHBand="0" w:noVBand="1"/>
+      </w:tblPr>
+      <w:tblGrid>
+        <w:gridCol w:w="1190"/>
+        <w:gridCol w:w="1430"/>
+        <w:gridCol w:w="6396"/>
+      </w:tblGrid>
+      <w:tr>
+        <w:tc>
+          <w:tcPr>
+            <w:tcW w:w="0" w:type="auto"/>
+            <w:tcBorders>
+              <w:top w:val="single" w:sz="4" w:space="0" w:color="000000"/>
+              <w:left w:val="single" w:sz="4" w:space="0" w:color="000000"/>
+              <w:bottom w:val="single" w:sz="4" w:space="0" w:color="000000"/>
+              <w:right w:val="single" w:sz="4" w:space="0" w:color="000000"/>
+            </w:tcBorders>
+            <w:tcMar>
+              <w:top w:w="0" w:type="dxa"/>
+              <w:left w:w="108" w:type="dxa"/>
+              <w:bottom w:w="0" w:type="dxa"/>
+              <w:right w:w="108" w:type="dxa"/>
+            </w:tcMar>
+            <w:hideMark/>
+          </w:tcPr>
+          <w:p>
+            <w:pPr>
+              <w:spacing w:after="0" w:line="240" w:lineRule="auto"/>
+              <w:rPr>
+                <w:rFonts w:ascii="Arial" w:eastAsia="Times New Roman" w:hAnsi="Arial" w:cs="Arial"/>
+                <w:kern w:val="0"/>
+                <w:lang w:eastAsia="en-GB"/>
+                <w14:ligatures w14:val="none"/>
+              </w:rPr>
+            </w:pPr>
+            <w:r>
+              <w:rPr>
+                <w:rFonts w:ascii="Arial" w:eastAsia="Times New Roman" w:hAnsi="Arial" w:cs="Arial"/>
+                <w:color w:val="000000"/>
+                <w:kern w:val="0"/>
+                <w:lang w:eastAsia="en-GB"/>
+                <w14:ligatures w14:val="none"/>
+              </w:rPr>
+              <w:t>Field</w:t>
+            </w:r>
+          </w:p>
+        </w:tc>
+        <w:tc>
+          <w:tcPr>
+            <w:tcW w:w="0" w:type="auto"/>
+            <w:tcBorders>
+              <w:top w:val="single" w:sz="4" w:space="0" w:color="000000"/>
+              <w:left w:val="single" w:sz="4" w:space="0" w:color="000000"/>
+              <w:bottom w:val="single" w:sz="4" w:space="0" w:color="000000"/>
+              <w:right w:val="single" w:sz="4" w:space="0" w:color="000000"/>
+            </w:tcBorders>
+            <w:tcMar>
+              <w:top w:w="0" w:type="dxa"/>
+              <w:left w:w="108" w:type="dxa"/>
+              <w:bottom w:w="0" w:type="dxa"/>
+              <w:right w:w="108" w:type="dxa"/>
+            </w:tcMar>
+            <w:hideMark/>
+          </w:tcPr>
+          <w:p>
+            <w:pPr>
+              <w:spacing w:after="0" w:line="240" w:lineRule="auto"/>
+              <w:rPr>
+                <w:rFonts w:ascii="Arial" w:eastAsia="Times New Roman" w:hAnsi="Arial" w:cs="Arial"/>
+                <w:kern w:val="0"/>
+                <w:lang w:eastAsia="en-GB"/>
+                <w14:ligatures w14:val="none"/>
+              </w:rPr>
+            </w:pPr>
+            <w:r>
+              <w:rPr>
+                <w:rFonts w:ascii="Arial" w:eastAsia="Times New Roman" w:hAnsi="Arial" w:cs="Arial"/>
+                <w:color w:val="000000"/>
+                <w:kern w:val="0"/>
+                <w:lang w:eastAsia="en-GB"/>
+                <w14:ligatures w14:val="none"/>
+              </w:rPr>
+              <w:t>Type</w:t>
+            </w:r>
+          </w:p>
+        </w:tc>
+        <w:tc>
+          <w:tcPr>
+            <w:tcW w:w="0" w:type="auto"/>
+            <w:tcBorders>
+              <w:top w:val="single" w:sz="4" w:space="0" w:color="000000"/>
+              <w:left w:val="single" w:sz="4" w:space="0" w:color="000000"/>
+              <w:bottom w:val="single" w:sz="4" w:space="0" w:color="000000"/>
+              <w:right w:val="single" w:sz="4" w:space="0" w:color="000000"/>
+            </w:tcBorders>
+            <w:tcMar>
+              <w:top w:w="0" w:type="dxa"/>
+              <w:left w:w="108" w:type="dxa"/>
+              <w:bottom w:w="0" w:type="dxa"/>
+              <w:right w:w="108" w:type="dxa"/>
+            </w:tcMar>
+            <w:hideMark/>
+          </w:tcPr>
+          <w:p>
+            <w:pPr>
+              <w:spacing w:after="0" w:line="240" w:lineRule="auto"/>
+              <w:rPr>
+                <w:rFonts w:ascii="Arial" w:eastAsia="Times New Roman" w:hAnsi="Arial" w:cs="Arial"/>
+                <w:kern w:val="0"/>
+                <w:lang w:eastAsia="en-GB"/>
+                <w14:ligatures w14:val="none"/>
+              </w:rPr>
+            </w:pPr>
+            <w:r>
+              <w:rPr>
+                <w:rFonts w:ascii="Arial" w:eastAsia="Times New Roman" w:hAnsi="Arial" w:cs="Arial"/>
+                <w:color w:val="000000"/>
+                <w:kern w:val="0"/>
+                <w:lang w:eastAsia="en-GB"/>
+                <w14:ligatures w14:val="none"/>
+              </w:rPr>
+              <w:t>Purpose</w:t>
+            </w:r>
+          </w:p>
+        </w:tc>
+      </w:tr>
+      <w:tr>
+        <w:tc>
+          <w:tcPr>
+            <w:tcW w:w="0" w:type="auto"/>
+            <w:tcBorders>
+              <w:top w:val="single" w:sz="4" w:space="0" w:color="000000"/>
+              <w:left w:val="single" w:sz="4" w:space="0" w:color="000000"/>
+              <w:bottom w:val="single" w:sz="4" w:space="0" w:color="000000"/>
+              <w:right w:val="single" w:sz="4" w:space="0" w:color="000000"/>
+            </w:tcBorders>
+            <w:tcMar>
+              <w:top w:w="0" w:type="dxa"/>
+              <w:left w:w="108" w:type="dxa"/>
+              <w:bottom w:w="0" w:type="dxa"/>
+              <w:right w:w="108" w:type="dxa"/>
+            </w:tcMar>
+            <w:hideMark/>
+          </w:tcPr>
+          <w:p>
+            <w:pPr>
+              <w:spacing w:after="0" w:line="240" w:lineRule="auto"/>
+              <w:rPr>
+                <w:rFonts w:ascii="Arial" w:eastAsia="Times New Roman" w:hAnsi="Arial" w:cs="Arial"/>
+                <w:kern w:val="0"/>
+                <w:lang w:eastAsia="en-GB"/>
+                <w14:ligatures w14:val="none"/>
+              </w:rPr>
+            </w:pPr>
+            <w:r>
+              <w:rPr>
+                <w:rFonts w:ascii="Arial" w:eastAsia="Times New Roman" w:hAnsi="Arial" w:cs="Arial"/>
+                <w:color w:val="000000"/>
+                <w:kern w:val="0"/>
+                <w:lang w:eastAsia="en-GB"/>
+                <w14:ligatures w14:val="none"/>
+              </w:rPr>
+              <w:t>type</w:t>
+            </w:r>
+          </w:p>
+        </w:tc>
+        <w:tc>
+          <w:tcPr>
+            <w:tcW w:w="0" w:type="auto"/>
+            <w:tcBorders>
+              <w:top w:val="single" w:sz="4" w:space="0" w:color="000000"/>
+              <w:left w:val="single" w:sz="4" w:space="0" w:color="000000"/>
+              <w:bottom w:val="single" w:sz="4" w:space="0" w:color="000000"/>
+              <w:right w:val="single" w:sz="4" w:space="0" w:color="000000"/>
+            </w:tcBorders>
+            <w:tcMar>
+              <w:top w:w="0" w:type="dxa"/>
+              <w:left w:w="108" w:type="dxa"/>
+              <w:bottom w:w="0" w:type="dxa"/>
+              <w:right w:w="108" w:type="dxa"/>
+            </w:tcMar>
+            <w:hideMark/>
+          </w:tcPr>
+          <w:p>
+            <w:pPr>
+              <w:spacing w:after="0" w:line="240" w:lineRule="auto"/>
+              <w:rPr>
+                <w:rFonts w:ascii="Arial" w:eastAsia="Times New Roman" w:hAnsi="Arial" w:cs="Arial"/>
+                <w:kern w:val="0"/>
+                <w:lang w:eastAsia="en-GB"/>
+                <w14:ligatures w14:val="none"/>
+              </w:rPr>
+            </w:pPr>
+            <w:proofErr w:type="spellStart"/>
+            <w:r>
+              <w:rPr>
+                <w:rFonts w:ascii="Arial" w:eastAsia="Times New Roman" w:hAnsi="Arial" w:cs="Arial"/>
+                <w:color w:val="000000"/>
+                <w:kern w:val="0"/>
+                <w:lang w:eastAsia="en-GB"/>
+                <w14:ligatures w14:val="none"/>
+              </w:rPr>
+              <w:t>NoticeType</w:t>
+            </w:r>
+            <w:proofErr w:type="spellEnd"/>
+          </w:p>
+        </w:tc>
+        <w:tc>
+          <w:tcPr>
+            <w:tcW w:w="0" w:type="auto"/>
+            <w:tcBorders>
+              <w:top w:val="single" w:sz="4" w:space="0" w:color="000000"/>
+              <w:left w:val="single" w:sz="4" w:space="0" w:color="000000"/>
+              <w:bottom w:val="single" w:sz="4" w:space="0" w:color="000000"/>
+              <w:right w:val="single" w:sz="4" w:space="0" w:color="000000"/>
+            </w:tcBorders>
+            <w:tcMar>
+              <w:top w:w="0" w:type="dxa"/>
+              <w:left w:w="108" w:type="dxa"/>
+              <w:bottom w:w="0" w:type="dxa"/>
+              <w:right w:w="108" w:type="dxa"/>
+            </w:tcMar>
+            <w:hideMark/>
+          </w:tcPr>
+          <w:p>
+            <w:pPr>
+              <w:spacing w:after="0" w:line="240" w:lineRule="auto"/>
+              <w:rPr>
+                <w:rFonts w:ascii="Arial" w:eastAsia="Times New Roman" w:hAnsi="Arial" w:cs="Arial"/>
+                <w:kern w:val="0"/>
+                <w:lang w:eastAsia="en-GB"/>
+                <w14:ligatures w14:val="none"/>
+              </w:rPr>
+            </w:pPr>
+            <w:r>
+              <w:rPr>
+                <w:rFonts w:ascii="Arial" w:eastAsia="Times New Roman" w:hAnsi="Arial" w:cs="Arial"/>
+                <w:color w:val="000000"/>
+                <w:kern w:val="0"/>
+                <w:lang w:eastAsia="en-GB"/>
+                <w14:ligatures w14:val="none"/>
+              </w:rPr>
+              <w:t>Which of the 11 notice kinds it is. It drives the ‘switch’ in every concrete leaf's update()</w:t>
+            </w:r>
+          </w:p>
+        </w:tc>
+      </w:tr>
+      <w:tr>
+        <w:tc>
+          <w:tcPr>
+            <w:tcW w:w="0" w:type="auto"/>
+            <w:tcBorders>
+              <w:top w:val="single" w:sz="4" w:space="0" w:color="000000"/>
+              <w:left w:val="single" w:sz="4" w:space="0" w:color="000000"/>
+              <w:bottom w:val="single" w:sz="4" w:space="0" w:color="000000"/>
+              <w:right w:val="single" w:sz="4" w:space="0" w:color="000000"/>
+            </w:tcBorders>
+            <w:tcMar>
+              <w:top w:w="0" w:type="dxa"/>
+              <w:left w:w="108" w:type="dxa"/>
+              <w:bottom w:w="0" w:type="dxa"/>
+              <w:right w:w="108" w:type="dxa"/>
+            </w:tcMar>
+            <w:hideMark/>
+          </w:tcPr>
+          <w:p>
+            <w:pPr>
+              <w:spacing w:after="0" w:line="240" w:lineRule="auto"/>
+              <w:rPr>
+                <w:rFonts w:ascii="Arial" w:eastAsia="Times New Roman" w:hAnsi="Arial" w:cs="Arial"/>
+                <w:kern w:val="0"/>
+                <w:lang w:eastAsia="en-GB"/>
+                <w14:ligatures w14:val="none"/>
+              </w:rPr>
+            </w:pPr>
+            <w:r>
+              <w:rPr>
+                <w:rFonts w:ascii="Arial" w:eastAsia="Times New Roman" w:hAnsi="Arial" w:cs="Arial"/>
+                <w:color w:val="000000"/>
+                <w:kern w:val="0"/>
+                <w:lang w:eastAsia="en-GB"/>
+                <w14:ligatures w14:val="none"/>
+              </w:rPr>
+              <w:t>message</w:t>
+            </w:r>
+          </w:p>
+        </w:tc>
+        <w:tc>
+          <w:tcPr>
+            <w:tcW w:w="0" w:type="auto"/>
+            <w:tcBorders>
+              <w:top w:val="single" w:sz="4" w:space="0" w:color="000000"/>
+              <w:left w:val="single" w:sz="4" w:space="0" w:color="000000"/>
+              <w:bottom w:val="single" w:sz="4" w:space="0" w:color="000000"/>
+              <w:right w:val="single" w:sz="4" w:space="0" w:color="000000"/>
+            </w:tcBorders>
+            <w:tcMar>
+              <w:top w:w="0" w:type="dxa"/>
+              <w:left w:w="108" w:type="dxa"/>
+              <w:bottom w:w="0" w:type="dxa"/>
+              <w:right w:w="108" w:type="dxa"/>
+            </w:tcMar>
+            <w:hideMark/>
+          </w:tcPr>
+          <w:p>
+            <w:pPr>
+              <w:spacing w:after="0" w:line="240" w:lineRule="auto"/>
+              <w:rPr>
+                <w:rFonts w:ascii="Arial" w:eastAsia="Times New Roman" w:hAnsi="Arial" w:cs="Arial"/>
+                <w:kern w:val="0"/>
+                <w:lang w:eastAsia="en-GB"/>
+                <w14:ligatures w14:val="none"/>
+              </w:rPr>
+            </w:pPr>
+            <w:r>
+              <w:rPr>
+                <w:rFonts w:ascii="Arial" w:eastAsia="Times New Roman" w:hAnsi="Arial" w:cs="Arial"/>
+                <w:color w:val="000000"/>
+                <w:kern w:val="0"/>
+                <w:lang w:eastAsia="en-GB"/>
+                <w14:ligatures w14:val="none"/>
+              </w:rPr>
+              <w:t>string</w:t>
+            </w:r>
+          </w:p>
+        </w:tc>
+        <w:tc>
+          <w:tcPr>
+            <w:tcW w:w="0" w:type="auto"/>
+            <w:tcBorders>
+              <w:top w:val="single" w:sz="4" w:space="0" w:color="000000"/>
+              <w:left w:val="single" w:sz="4" w:space="0" w:color="000000"/>
+              <w:bottom w:val="single" w:sz="4" w:space="0" w:color="000000"/>
+              <w:right w:val="single" w:sz="4" w:space="0" w:color="000000"/>
+            </w:tcBorders>
+            <w:tcMar>
+              <w:top w:w="0" w:type="dxa"/>
+              <w:left w:w="108" w:type="dxa"/>
+              <w:bottom w:w="0" w:type="dxa"/>
+              <w:right w:w="108" w:type="dxa"/>
+            </w:tcMar>
+            <w:hideMark/>
+          </w:tcPr>
+          <w:p>
+            <w:pPr>
+              <w:spacing w:after="0" w:line="240" w:lineRule="auto"/>
+              <w:rPr>
+                <w:rFonts w:ascii="Arial" w:eastAsia="Times New Roman" w:hAnsi="Arial" w:cs="Arial"/>
+                <w:kern w:val="0"/>
+                <w:lang w:eastAsia="en-GB"/>
+                <w14:ligatures w14:val="none"/>
+              </w:rPr>
+            </w:pPr>
+            <w:r>
+              <w:rPr>
+                <w:rFonts w:ascii="Arial" w:eastAsia="Times New Roman" w:hAnsi="Arial" w:cs="Arial"/>
+                <w:color w:val="000000"/>
+                <w:kern w:val="0"/>
+                <w:lang w:eastAsia="en-GB"/>
+                <w14:ligatures w14:val="none"/>
+              </w:rPr>
+              <w:t>Creates string to display information in main. Displayed by ‘InfoPoint’ and is logged everywhere</w:t>
+            </w:r>
+          </w:p>
+        </w:tc>
+      </w:tr>
+      <w:tr>
+        <w:tc>
+          <w:tcPr>
+            <w:tcW w:w="0" w:type="auto"/>
+            <w:tcBorders>
+              <w:top w:val="single" w:sz="4" w:space="0" w:color="000000"/>
+              <w:left w:val="single" w:sz="4" w:space="0" w:color="000000"/>
+              <w:bottom w:val="single" w:sz="4" w:space="0" w:color="000000"/>
+              <w:right w:val="single" w:sz="4" w:space="0" w:color="000000"/>
+            </w:tcBorders>
+            <w:tcMar>
+              <w:top w:w="0" w:type="dxa"/>
+              <w:left w:w="108" w:type="dxa"/>
+              <w:bottom w:w="0" w:type="dxa"/>
+              <w:right w:w="108" w:type="dxa"/>
+            </w:tcMar>
+            <w:hideMark/>
+          </w:tcPr>
+          <w:p>
+            <w:pPr>
+              <w:spacing w:after="0" w:line="240" w:lineRule="auto"/>
+              <w:rPr>
+                <w:rFonts w:ascii="Arial" w:eastAsia="Times New Roman" w:hAnsi="Arial" w:cs="Arial"/>
+                <w:kern w:val="0"/>
+                <w:lang w:eastAsia="en-GB"/>
+                <w14:ligatures w14:val="none"/>
+              </w:rPr>
+            </w:pPr>
+            <w:r>
+              <w:rPr>
+                <w:rFonts w:ascii="Arial" w:eastAsia="Times New Roman" w:hAnsi="Arial" w:cs="Arial"/>
+                <w:color w:val="000000"/>
+                <w:kern w:val="0"/>
+                <w:lang w:eastAsia="en-GB"/>
+                <w14:ligatures w14:val="none"/>
+              </w:rPr>
+              <w:t>source</w:t>
+            </w:r>
+          </w:p>
+        </w:tc>
+        <w:tc>
+          <w:tcPr>
+            <w:tcW w:w="0" w:type="auto"/>
+            <w:tcBorders>
+              <w:top w:val="single" w:sz="4" w:space="0" w:color="000000"/>
+              <w:left w:val="single" w:sz="4" w:space="0" w:color="000000"/>
+              <w:bottom w:val="single" w:sz="4" w:space="0" w:color="000000"/>
+              <w:right w:val="single" w:sz="4" w:space="0" w:color="000000"/>
+            </w:tcBorders>
+            <w:tcMar>
+              <w:top w:w="0" w:type="dxa"/>
+              <w:left w:w="108" w:type="dxa"/>
+              <w:bottom w:w="0" w:type="dxa"/>
+              <w:right w:w="108" w:type="dxa"/>
+            </w:tcMar>
+            <w:hideMark/>
+          </w:tcPr>
+          <w:p>
+            <w:pPr>
+              <w:spacing w:after="0" w:line="240" w:lineRule="auto"/>
+              <w:rPr>
+                <w:rFonts w:ascii="Arial" w:eastAsia="Times New Roman" w:hAnsi="Arial" w:cs="Arial"/>
+                <w:kern w:val="0"/>
+                <w:lang w:eastAsia="en-GB"/>
+                <w14:ligatures w14:val="none"/>
+              </w:rPr>
+            </w:pPr>
+            <w:r>
+              <w:rPr>
+                <w:rFonts w:ascii="Arial" w:eastAsia="Times New Roman" w:hAnsi="Arial" w:cs="Arial"/>
+                <w:color w:val="000000"/>
+                <w:kern w:val="0"/>
+                <w:lang w:eastAsia="en-GB"/>
+                <w14:ligatures w14:val="none"/>
+              </w:rPr>
+              <w:t>string</w:t>
+            </w:r>
+          </w:p>
+        </w:tc>
+        <w:tc>
+          <w:tcPr>
+            <w:tcW w:w="0" w:type="auto"/>
+            <w:tcBorders>
+              <w:top w:val="single" w:sz="4" w:space="0" w:color="000000"/>
+              <w:left w:val="single" w:sz="4" w:space="0" w:color="000000"/>
+              <w:bottom w:val="single" w:sz="4" w:space="0" w:color="000000"/>
+              <w:right w:val="single" w:sz="4" w:space="0" w:color="000000"/>
+            </w:tcBorders>
+            <w:tcMar>
+              <w:top w:w="0" w:type="dxa"/>
+              <w:left w:w="108" w:type="dxa"/>
+              <w:bottom w:w="0" w:type="dxa"/>
+              <w:right w:w="108" w:type="dxa"/>
+            </w:tcMar>
+            <w:hideMark/>
+          </w:tcPr>
+          <w:p>
+            <w:pPr>
+              <w:spacing w:after="0" w:line="240" w:lineRule="auto"/>
+              <w:rPr>
+                <w:rFonts w:ascii="Arial" w:eastAsia="Times New Roman" w:hAnsi="Arial" w:cs="Arial"/>
+                <w:kern w:val="0"/>
+                <w:lang w:eastAsia="en-GB"/>
+                <w14:ligatures w14:val="none"/>
+              </w:rPr>
+            </w:pPr>
+            <w:r>
+              <w:rPr>
+                <w:rFonts w:ascii="Arial" w:eastAsia="Times New Roman" w:hAnsi="Arial" w:cs="Arial"/>
+                <w:color w:val="000000"/>
+                <w:kern w:val="0"/>
+                <w:lang w:eastAsia="en-GB"/>
+                <w14:ligatures w14:val="none"/>
+              </w:rPr>
+              <w:t>Which subject issued the notice (currently "</w:t>
+            </w:r>
+            <w:proofErr w:type="spellStart"/>
+            <w:r>
+              <w:rPr>
+                <w:rFonts w:ascii="Arial" w:eastAsia="Times New Roman" w:hAnsi="Arial" w:cs="Arial"/>
+                <w:color w:val="000000"/>
+                <w:kern w:val="0"/>
+                <w:lang w:eastAsia="en-GB"/>
+                <w14:ligatures w14:val="none"/>
+              </w:rPr>
+              <w:t>Lentedag</w:t>
+            </w:r>
+            <w:proofErr w:type="spellEnd"/>
+            <w:r>
+              <w:rPr>
+                <w:rFonts w:ascii="Arial" w:eastAsia="Times New Roman" w:hAnsi="Arial" w:cs="Arial"/>
+                <w:color w:val="000000"/>
+                <w:kern w:val="0"/>
+                <w:lang w:eastAsia="en-GB"/>
+                <w14:ligatures w14:val="none"/>
+              </w:rPr>
+              <w:t xml:space="preserve"> Control” for all root-level notices)</w:t>
+            </w:r>
+          </w:p>
+        </w:tc>
+      </w:tr>
+      <w:tr>
+        <w:tc>
+          <w:tcPr>
+            <w:tcW w:w="0" w:type="auto"/>
+            <w:tcBorders>
+              <w:top w:val="single" w:sz="4" w:space="0" w:color="000000"/>
+              <w:left w:val="single" w:sz="4" w:space="0" w:color="000000"/>
+              <w:bottom w:val="single" w:sz="4" w:space="0" w:color="000000"/>
+              <w:right w:val="single" w:sz="4" w:space="0" w:color="000000"/>
+            </w:tcBorders>
+            <w:tcMar>
+              <w:top w:w="0" w:type="dxa"/>
+              <w:left w:w="108" w:type="dxa"/>
+              <w:bottom w:w="0" w:type="dxa"/>
+              <w:right w:w="108" w:type="dxa"/>
+            </w:tcMar>
+            <w:hideMark/>
+          </w:tcPr>
+          <w:p>
+            <w:pPr>
+              <w:spacing w:after="0" w:line="240" w:lineRule="auto"/>
+              <w:rPr>
+                <w:rFonts w:ascii="Arial" w:eastAsia="Times New Roman" w:hAnsi="Arial" w:cs="Arial"/>
+                <w:kern w:val="0"/>
+                <w:lang w:eastAsia="en-GB"/>
+                <w14:ligatures w14:val="none"/>
+              </w:rPr>
+            </w:pPr>
+            <w:r>
+              <w:rPr>
+                <w:rFonts w:ascii="Arial" w:eastAsia="Times New Roman" w:hAnsi="Arial" w:cs="Arial"/>
+                <w:color w:val="000000"/>
+                <w:kern w:val="0"/>
+                <w:lang w:eastAsia="en-GB"/>
+                <w14:ligatures w14:val="none"/>
+              </w:rPr>
+              <w:t>location</w:t>
+            </w:r>
+          </w:p>
+        </w:tc>
+        <w:tc>
+          <w:tcPr>
+            <w:tcW w:w="0" w:type="auto"/>
+            <w:tcBorders>
+              <w:top w:val="single" w:sz="4" w:space="0" w:color="000000"/>
+              <w:left w:val="single" w:sz="4" w:space="0" w:color="000000"/>
+              <w:bottom w:val="single" w:sz="4" w:space="0" w:color="000000"/>
+              <w:right w:val="single" w:sz="4" w:space="0" w:color="000000"/>
+            </w:tcBorders>
+            <w:tcMar>
+              <w:top w:w="0" w:type="dxa"/>
+              <w:left w:w="108" w:type="dxa"/>
+              <w:bottom w:w="0" w:type="dxa"/>
+              <w:right w:w="108" w:type="dxa"/>
+            </w:tcMar>
+            <w:hideMark/>
+          </w:tcPr>
+          <w:p>
+            <w:pPr>
+              <w:spacing w:after="0" w:line="240" w:lineRule="auto"/>
+              <w:rPr>
+                <w:rFonts w:ascii="Arial" w:eastAsia="Times New Roman" w:hAnsi="Arial" w:cs="Arial"/>
+                <w:kern w:val="0"/>
+                <w:lang w:eastAsia="en-GB"/>
+                <w14:ligatures w14:val="none"/>
+              </w:rPr>
+            </w:pPr>
+            <w:r>
+              <w:rPr>
+                <w:rFonts w:ascii="Arial" w:eastAsia="Times New Roman" w:hAnsi="Arial" w:cs="Arial"/>
+                <w:color w:val="000000"/>
+                <w:kern w:val="0"/>
+                <w:lang w:eastAsia="en-GB"/>
+                <w14:ligatures w14:val="none"/>
+              </w:rPr>
+              <w:t>string</w:t>
+            </w:r>
+          </w:p>
+        </w:tc>
+        <w:tc>
+          <w:tcPr>
+            <w:tcW w:w="0" w:type="auto"/>
+            <w:tcBorders>
+              <w:top w:val="single" w:sz="4" w:space="0" w:color="000000"/>
+              <w:left w:val="single" w:sz="4" w:space="0" w:color="000000"/>
+              <w:bottom w:val="single" w:sz="4" w:space="0" w:color="000000"/>
+              <w:right w:val="single" w:sz="4" w:space="0" w:color="000000"/>
+            </w:tcBorders>
+            <w:tcMar>
+              <w:top w:w="0" w:type="dxa"/>
+              <w:left w:w="108" w:type="dxa"/>
+              <w:bottom w:w="0" w:type="dxa"/>
+              <w:right w:w="108" w:type="dxa"/>
+            </w:tcMar>
+            <w:hideMark/>
+          </w:tcPr>
+          <w:p>
+            <w:pPr>
+              <w:spacing w:after="0" w:line="240" w:lineRule="auto"/>
+              <w:rPr>
+                <w:rFonts w:ascii="Arial" w:eastAsia="Times New Roman" w:hAnsi="Arial" w:cs="Arial"/>
+                <w:kern w:val="0"/>
+                <w:lang w:eastAsia="en-GB"/>
+                <w14:ligatures w14:val="none"/>
+              </w:rPr>
+            </w:pPr>
+            <w:r>
+              <w:rPr>
+                <w:rFonts w:ascii="Arial" w:eastAsia="Times New Roman" w:hAnsi="Arial" w:cs="Arial"/>
+                <w:color w:val="000000"/>
+                <w:kern w:val="0"/>
+                <w:lang w:eastAsia="en-GB"/>
+                <w14:ligatures w14:val="none"/>
+              </w:rPr>
+              <w:t>Affected area's name, e.g. "Jacaranda Stage Area".</w:t>
+            </w:r>
+          </w:p>
+        </w:tc>
+      </w:tr>
+      <w:tr>
+        <w:tc>
+          <w:tcPr>
+            <w:tcW w:w="0" w:type="auto"/>
+            <w:tcBorders>
+              <w:top w:val="single" w:sz="4" w:space="0" w:color="000000"/>
+              <w:left w:val="single" w:sz="4" w:space="0" w:color="000000"/>
+              <w:bottom w:val="single" w:sz="4" w:space="0" w:color="000000"/>
+              <w:right w:val="single" w:sz="4" w:space="0" w:color="000000"/>
+            </w:tcBorders>
+            <w:tcMar>
+              <w:top w:w="0" w:type="dxa"/>
+              <w:left w:w="108" w:type="dxa"/>
+              <w:bottom w:w="0" w:type="dxa"/>
+              <w:right w:w="108" w:type="dxa"/>
+            </w:tcMar>
+            <w:hideMark/>
+          </w:tcPr>
+          <w:p>
+            <w:pPr>
+              <w:spacing w:after="0" w:line="240" w:lineRule="auto"/>
+              <w:rPr>
+                <w:rFonts w:ascii="Arial" w:eastAsia="Times New Roman" w:hAnsi="Arial" w:cs="Arial"/>
+                <w:kern w:val="0"/>
+                <w:lang w:eastAsia="en-GB"/>
+                <w14:ligatures w14:val="none"/>
+              </w:rPr>
+            </w:pPr>
+            <w:r>
+              <w:rPr>
+                <w:rFonts w:ascii="Arial" w:eastAsia="Times New Roman" w:hAnsi="Arial" w:cs="Arial"/>
+                <w:color w:val="000000"/>
+                <w:kern w:val="0"/>
+                <w:lang w:eastAsia="en-GB"/>
+                <w14:ligatures w14:val="none"/>
+              </w:rPr>
+              <w:t>value</w:t>
+            </w:r>
+          </w:p>
+        </w:tc>
+        <w:tc>
+          <w:tcPr>
+            <w:tcW w:w="0" w:type="auto"/>
+            <w:tcBorders>
+              <w:top w:val="single" w:sz="4" w:space="0" w:color="000000"/>
+              <w:left w:val="single" w:sz="4" w:space="0" w:color="000000"/>
+              <w:bottom w:val="single" w:sz="4" w:space="0" w:color="000000"/>
+              <w:right w:val="single" w:sz="4" w:space="0" w:color="000000"/>
+            </w:tcBorders>
+            <w:tcMar>
+              <w:top w:w="0" w:type="dxa"/>
+              <w:left w:w="108" w:type="dxa"/>
+              <w:bottom w:w="0" w:type="dxa"/>
+              <w:right w:w="108" w:type="dxa"/>
+            </w:tcMar>
+            <w:hideMark/>
+          </w:tcPr>
+          <w:p>
+            <w:pPr>
+              <w:spacing w:after="0" w:line="240" w:lineRule="auto"/>
+              <w:rPr>
+                <w:rFonts w:ascii="Arial" w:eastAsia="Times New Roman" w:hAnsi="Arial" w:cs="Arial"/>
+                <w:kern w:val="0"/>
+                <w:lang w:eastAsia="en-GB"/>
+                <w14:ligatures w14:val="none"/>
+              </w:rPr>
+            </w:pPr>
+            <w:r>
+              <w:rPr>
+                <w:rFonts w:ascii="Arial" w:eastAsia="Times New Roman" w:hAnsi="Arial" w:cs="Arial"/>
+                <w:color w:val="000000"/>
+                <w:kern w:val="0"/>
+                <w:lang w:eastAsia="en-GB"/>
+                <w14:ligatures w14:val="none"/>
+              </w:rPr>
+              <w:t>int</w:t>
+            </w:r>
+          </w:p>
+        </w:tc>
+        <w:tc>
+          <w:tcPr>
+            <w:tcW w:w="0" w:type="auto"/>
+            <w:tcBorders>
+              <w:top w:val="single" w:sz="4" w:space="0" w:color="000000"/>
+              <w:left w:val="single" w:sz="4" w:space="0" w:color="000000"/>
+              <w:bottom w:val="single" w:sz="4" w:space="0" w:color="000000"/>
+              <w:right w:val="single" w:sz="4" w:space="0" w:color="000000"/>
+            </w:tcBorders>
+            <w:tcMar>
+              <w:top w:w="0" w:type="dxa"/>
+              <w:left w:w="108" w:type="dxa"/>
+              <w:bottom w:w="0" w:type="dxa"/>
+              <w:right w:w="108" w:type="dxa"/>
+            </w:tcMar>
+            <w:hideMark/>
+          </w:tcPr>
+          <w:p>
+            <w:pPr>
+              <w:spacing w:after="0" w:line="240" w:lineRule="auto"/>
+              <w:rPr>
+                <w:rFonts w:ascii="Arial" w:eastAsia="Times New Roman" w:hAnsi="Arial" w:cs="Arial"/>
+                <w:kern w:val="0"/>
+                <w:lang w:eastAsia="en-GB"/>
+                <w14:ligatures w14:val="none"/>
+              </w:rPr>
+            </w:pPr>
+            <w:r>
+              <w:rPr>
+                <w:rFonts w:ascii="Arial" w:eastAsia="Times New Roman" w:hAnsi="Arial" w:cs="Arial"/>
+                <w:color w:val="000000"/>
+                <w:kern w:val="0"/>
+                <w:lang w:eastAsia="en-GB"/>
+                <w14:ligatures w14:val="none"/>
+              </w:rPr>
+              <w:t>An optional numeric payload (delay minutes, attendance count, temperature.)</w:t>
+            </w:r>
+          </w:p>
+        </w:tc>
+      </w:tr>
+    </w:tbl>
+    <w:p>
+      <w:pPr>
+        <w:rPr>
+          <w:rFonts w:ascii="Arial" w:hAnsi="Arial" w:cs="Arial"/>
+          <w:color w:val="000000" w:themeColor="text1"/>
         </w:rPr>
       </w:pPr>
     </w:p>
@@ -3090,6 +3979,8 @@
       <w:pPr>
         <w:rPr>
           <w:rFonts w:ascii="Arial" w:hAnsi="Arial" w:cs="Arial"/>
+          <w:b/>
+          <w:bCs/>
           <w:color w:val="000000" w:themeColor="text1"/>
           <w:lang w:val="en-US"/>
         </w:rPr>
@@ -3097,121 +3988,1311 @@
       <w:r>
         <w:rPr>
           <w:rFonts w:ascii="Arial" w:hAnsi="Arial" w:cs="Arial"/>
+          <w:b/>
+          <w:bCs/>
           <w:color w:val="000000" w:themeColor="text1"/>
           <w:lang w:val="en-US"/>
         </w:rPr>
-        <w:t xml:space="preserve">Task 6: </w:t>
-      </w:r>
-      <w:r>
-        <w:rPr>
-          <w:rFonts w:ascii="Arial" w:hAnsi="Arial" w:cs="Arial"/>
+        <w:t>Task 4:</w:t>
+      </w:r>
+      <w:r>
+        <w:rPr>
+          <w:rFonts w:ascii="Arial" w:hAnsi="Arial" w:cs="Arial"/>
+          <w:b/>
+          <w:bCs/>
           <w:color w:val="000000" w:themeColor="text1"/>
           <w:lang w:val="en-US"/>
         </w:rPr>
-        <w:t>(Hannah)</w:t>
+        <w:t xml:space="preserve"> (Kelly)</w:t>
       </w:r>
     </w:p>
     <w:p>
       <w:pPr>
+        <w:pStyle w:val="NormalWeb"/>
+        <w:spacing w:before="0" w:beforeAutospacing="0" w:after="160" w:afterAutospacing="0"/>
+        <w:rPr>
+          <w:rFonts w:ascii="Arial" w:hAnsi="Arial" w:cs="Arial"/>
+          <w:color w:val="000000"/>
+        </w:rPr>
+      </w:pPr>
+      <w:r>
         <w:rPr>
           <w:rFonts w:ascii="Arial" w:hAnsi="Arial" w:cs="Arial"/>
           <w:color w:val="000000" w:themeColor="text1"/>
           <w:lang w:val="en-US"/>
         </w:rPr>
-      </w:pPr>
-      <w:r>
-        <w:rPr>
-          <w:rFonts w:ascii="Arial" w:hAnsi="Arial" w:cs="Arial"/>
-          <w:color w:val="000000" w:themeColor="text1"/>
-          <w:lang w:val="en-US"/>
-        </w:rPr>
-        <w:t>Attached separately.</w:t>
+        <w:t xml:space="preserve">4.4) </w:t>
+      </w:r>
+      <w:r>
+        <w:rPr>
+          <w:rFonts w:ascii="Arial" w:hAnsi="Arial" w:cs="Arial"/>
+          <w:color w:val="000000"/>
+        </w:rPr>
+        <w:t>Three features: hydration/heat response, capacity-threshold crowd management, and mobile</w:t>
+      </w:r>
+      <w:r>
+        <w:rPr>
+          <w:rFonts w:ascii="Arial" w:hAnsi="Arial" w:cs="Arial"/>
+          <w:color w:val="000000"/>
+        </w:rPr>
+        <w:t xml:space="preserve"> </w:t>
+      </w:r>
+      <w:r>
+        <w:rPr>
+          <w:rFonts w:ascii="Arial" w:hAnsi="Arial" w:cs="Arial"/>
+          <w:color w:val="000000"/>
+        </w:rPr>
+        <w:t>unit reassignment. </w:t>
+      </w:r>
+      <w:r>
+        <w:rPr>
+          <w:rFonts w:ascii="Arial" w:hAnsi="Arial" w:cs="Arial"/>
+          <w:color w:val="000000"/>
+        </w:rPr>
+        <w:br/>
       </w:r>
     </w:p>
     <w:p>
       <w:pPr>
-        <w:rPr>
-          <w:rFonts w:ascii="Arial" w:hAnsi="Arial" w:cs="Arial"/>
-          <w:color w:val="000000" w:themeColor="text1"/>
-          <w:lang w:val="en-US"/>
-        </w:rPr>
-      </w:pPr>
+        <w:numPr>
+          <w:ilvl w:val="0"/>
+          <w:numId w:val="7"/>
+        </w:numPr>
+        <w:spacing w:after="0" w:line="240" w:lineRule="auto"/>
+        <w:textAlignment w:val="baseline"/>
+        <w:rPr>
+          <w:rFonts w:ascii="Arial" w:eastAsia="Times New Roman" w:hAnsi="Arial" w:cs="Arial"/>
+          <w:color w:val="000000"/>
+          <w:kern w:val="0"/>
+          <w:lang w:eastAsia="en-GB"/>
+          <w14:ligatures w14:val="none"/>
+        </w:rPr>
+      </w:pPr>
+      <w:r>
+        <w:rPr>
+          <w:rFonts w:ascii="Arial" w:eastAsia="Times New Roman" w:hAnsi="Arial" w:cs="Arial"/>
+          <w:color w:val="000000"/>
+          <w:kern w:val="0"/>
+          <w:lang w:eastAsia="en-GB"/>
+          <w14:ligatures w14:val="none"/>
+        </w:rPr>
+        <w:t>Hydration / heat-response feature (HYDRATION_ALERT):</w:t>
+      </w:r>
     </w:p>
     <w:p>
       <w:pPr>
-        <w:rPr>
-          <w:rFonts w:ascii="Arial" w:hAnsi="Arial" w:cs="Arial"/>
-          <w:color w:val="000000" w:themeColor="text1"/>
-          <w:lang w:val="en-US"/>
-        </w:rPr>
-      </w:pPr>
-      <w:r>
-        <w:rPr>
-          <w:rFonts w:ascii="Arial" w:hAnsi="Arial" w:cs="Arial"/>
-          <w:color w:val="000000" w:themeColor="text1"/>
-          <w:lang w:val="en-US"/>
-        </w:rPr>
-        <w:t>Task 7:</w:t>
-      </w:r>
-      <w:r>
-        <w:rPr>
-          <w:rFonts w:ascii="Arial" w:hAnsi="Arial" w:cs="Arial"/>
-          <w:color w:val="000000" w:themeColor="text1"/>
-          <w:lang w:val="en-US"/>
-        </w:rPr>
-        <w:t xml:space="preserve"> (Hannah)</w:t>
+        <w:numPr>
+          <w:ilvl w:val="0"/>
+          <w:numId w:val="8"/>
+        </w:numPr>
+        <w:spacing w:after="0" w:line="240" w:lineRule="auto"/>
+        <w:textAlignment w:val="baseline"/>
+        <w:rPr>
+          <w:rFonts w:ascii="Arial" w:eastAsia="Times New Roman" w:hAnsi="Arial" w:cs="Arial"/>
+          <w:color w:val="000000"/>
+          <w:kern w:val="0"/>
+          <w:lang w:eastAsia="en-GB"/>
+          <w14:ligatures w14:val="none"/>
+        </w:rPr>
+      </w:pPr>
+      <w:proofErr w:type="spellStart"/>
+      <w:r>
+        <w:rPr>
+          <w:rFonts w:ascii="Arial" w:eastAsia="Times New Roman" w:hAnsi="Arial" w:cs="Arial"/>
+          <w:color w:val="000000"/>
+          <w:kern w:val="0"/>
+          <w:lang w:eastAsia="en-GB"/>
+          <w14:ligatures w14:val="none"/>
+        </w:rPr>
+        <w:t>EventControl</w:t>
+      </w:r>
+      <w:proofErr w:type="spellEnd"/>
+      <w:r>
+        <w:rPr>
+          <w:rFonts w:ascii="Arial" w:eastAsia="Times New Roman" w:hAnsi="Arial" w:cs="Arial"/>
+          <w:color w:val="000000"/>
+          <w:kern w:val="0"/>
+          <w:lang w:eastAsia="en-GB"/>
+          <w14:ligatures w14:val="none"/>
+        </w:rPr>
+        <w:t>: issues a HYDRATION_ALERT when conditions call for it (e.g. high afternoon temperature). Every leaf type decides its own reaction:</w:t>
       </w:r>
     </w:p>
     <w:p>
       <w:pPr>
-        <w:pStyle w:val="pdq2pgselectionanchorcontainer"/>
-        <w:rPr>
-          <w:rFonts w:ascii="Arial" w:hAnsi="Arial" w:cs="Arial"/>
-          <w:color w:val="000000" w:themeColor="text1"/>
-        </w:rPr>
-      </w:pPr>
-      <w:r>
-        <w:rPr>
-          <w:rFonts w:ascii="Arial" w:hAnsi="Arial" w:cs="Arial"/>
-          <w:color w:val="000000" w:themeColor="text1"/>
-          <w:lang w:val="en-US"/>
-        </w:rPr>
-        <w:t xml:space="preserve">7.4) </w:t>
-      </w:r>
-      <w:r>
-        <w:rPr>
-          <w:rFonts w:ascii="Arial" w:hAnsi="Arial" w:cs="Arial"/>
-          <w:color w:val="000000" w:themeColor="text1"/>
-        </w:rPr>
-        <w:t xml:space="preserve">Our team divided the </w:t>
-      </w:r>
+        <w:numPr>
+          <w:ilvl w:val="0"/>
+          <w:numId w:val="8"/>
+        </w:numPr>
+        <w:spacing w:after="0" w:line="240" w:lineRule="auto"/>
+        <w:textAlignment w:val="baseline"/>
+        <w:rPr>
+          <w:rFonts w:ascii="Arial" w:eastAsia="Times New Roman" w:hAnsi="Arial" w:cs="Arial"/>
+          <w:color w:val="000000"/>
+          <w:kern w:val="0"/>
+          <w:lang w:eastAsia="en-GB"/>
+          <w14:ligatures w14:val="none"/>
+        </w:rPr>
+      </w:pPr>
       <w:proofErr w:type="spellStart"/>
       <w:r>
         <w:rPr>
-          <w:rFonts w:ascii="Arial" w:hAnsi="Arial" w:cs="Arial"/>
-          <w:color w:val="000000" w:themeColor="text1"/>
-        </w:rPr>
-        <w:t>EventFlow</w:t>
+          <w:rFonts w:ascii="Arial" w:eastAsia="Times New Roman" w:hAnsi="Arial" w:cs="Arial"/>
+          <w:color w:val="000000"/>
+          <w:kern w:val="0"/>
+          <w:lang w:eastAsia="en-GB"/>
+          <w14:ligatures w14:val="none"/>
+        </w:rPr>
+        <w:t>DrinkVendor</w:t>
       </w:r>
       <w:proofErr w:type="spellEnd"/>
       <w:r>
         <w:rPr>
-          <w:rFonts w:ascii="Arial" w:hAnsi="Arial" w:cs="Arial"/>
-          <w:color w:val="000000" w:themeColor="text1"/>
-        </w:rPr>
-        <w:t xml:space="preserve"> practical so that each member had a clear primary responsibility while still reviewing and understanding the full system.</w:t>
-      </w:r>
-      <w:r>
-        <w:rPr>
-          <w:rStyle w:val="apple-converted-space"/>
-          <w:rFonts w:ascii="Arial" w:hAnsi="Arial" w:cs="Arial"/>
-          <w:color w:val="000000" w:themeColor="text1"/>
-        </w:rPr>
-        <w:t xml:space="preserve"> We split the work according to marks, each person got 100 marks to do. I ( Hannah) got tasks 1, 6,7,8. Kelly got assigned tasks 2,3,4 and Shelby got assigned task 5. This way each person had equal amounts of work to do. </w:t>
+          <w:rFonts w:ascii="Arial" w:eastAsia="Times New Roman" w:hAnsi="Arial" w:cs="Arial"/>
+          <w:color w:val="000000"/>
+          <w:kern w:val="0"/>
+          <w:lang w:eastAsia="en-GB"/>
+          <w14:ligatures w14:val="none"/>
+        </w:rPr>
+        <w:t xml:space="preserve">: sets a private </w:t>
+      </w:r>
+      <w:proofErr w:type="spellStart"/>
+      <w:r>
+        <w:rPr>
+          <w:rFonts w:ascii="Arial" w:eastAsia="Times New Roman" w:hAnsi="Arial" w:cs="Arial"/>
+          <w:color w:val="000000"/>
+          <w:kern w:val="0"/>
+          <w:lang w:eastAsia="en-GB"/>
+          <w14:ligatures w14:val="none"/>
+        </w:rPr>
+        <w:t>waterPriority</w:t>
+      </w:r>
+      <w:proofErr w:type="spellEnd"/>
+      <w:r>
+        <w:rPr>
+          <w:rFonts w:ascii="Arial" w:eastAsia="Times New Roman" w:hAnsi="Arial" w:cs="Arial"/>
+          <w:color w:val="000000"/>
+          <w:kern w:val="0"/>
+          <w:lang w:eastAsia="en-GB"/>
+          <w14:ligatures w14:val="none"/>
+        </w:rPr>
+        <w:t xml:space="preserve"> flag and switches to water-priority service</w:t>
       </w:r>
     </w:p>
     <w:p>
       <w:pPr>
+        <w:numPr>
+          <w:ilvl w:val="0"/>
+          <w:numId w:val="8"/>
+        </w:numPr>
+        <w:spacing w:after="0" w:line="240" w:lineRule="auto"/>
+        <w:textAlignment w:val="baseline"/>
+        <w:rPr>
+          <w:rFonts w:ascii="Arial" w:eastAsia="Times New Roman" w:hAnsi="Arial" w:cs="Arial"/>
+          <w:color w:val="000000"/>
+          <w:kern w:val="0"/>
+          <w:lang w:eastAsia="en-GB"/>
+          <w14:ligatures w14:val="none"/>
+        </w:rPr>
+      </w:pPr>
+      <w:proofErr w:type="spellStart"/>
+      <w:r>
+        <w:rPr>
+          <w:rFonts w:ascii="Arial" w:eastAsia="Times New Roman" w:hAnsi="Arial" w:cs="Arial"/>
+          <w:color w:val="000000"/>
+          <w:kern w:val="0"/>
+          <w:lang w:eastAsia="en-GB"/>
+          <w14:ligatures w14:val="none"/>
+        </w:rPr>
+        <w:t>MedicalUnit</w:t>
+      </w:r>
+      <w:proofErr w:type="spellEnd"/>
+      <w:r>
+        <w:rPr>
+          <w:rFonts w:ascii="Arial" w:eastAsia="Times New Roman" w:hAnsi="Arial" w:cs="Arial"/>
+          <w:color w:val="000000"/>
+          <w:kern w:val="0"/>
+          <w:lang w:eastAsia="en-GB"/>
+          <w14:ligatures w14:val="none"/>
+        </w:rPr>
+        <w:t xml:space="preserve"> : sets </w:t>
+      </w:r>
+      <w:proofErr w:type="spellStart"/>
+      <w:r>
+        <w:rPr>
+          <w:rFonts w:ascii="Arial" w:eastAsia="Times New Roman" w:hAnsi="Arial" w:cs="Arial"/>
+          <w:color w:val="000000"/>
+          <w:kern w:val="0"/>
+          <w:lang w:eastAsia="en-GB"/>
+          <w14:ligatures w14:val="none"/>
+        </w:rPr>
+        <w:t>emergencyMode</w:t>
+      </w:r>
+      <w:proofErr w:type="spellEnd"/>
+      <w:r>
+        <w:rPr>
+          <w:rFonts w:ascii="Arial" w:eastAsia="Times New Roman" w:hAnsi="Arial" w:cs="Arial"/>
+          <w:color w:val="000000"/>
+          <w:kern w:val="0"/>
+          <w:lang w:eastAsia="en-GB"/>
+          <w14:ligatures w14:val="none"/>
+        </w:rPr>
+        <w:t xml:space="preserve"> and </w:t>
+      </w:r>
+      <w:proofErr w:type="spellStart"/>
+      <w:r>
+        <w:rPr>
+          <w:rFonts w:ascii="Arial" w:eastAsia="Times New Roman" w:hAnsi="Arial" w:cs="Arial"/>
+          <w:color w:val="000000"/>
+          <w:kern w:val="0"/>
+          <w:lang w:eastAsia="en-GB"/>
+          <w14:ligatures w14:val="none"/>
+        </w:rPr>
+        <w:t>preparesheat</w:t>
+      </w:r>
+      <w:proofErr w:type="spellEnd"/>
+      <w:r>
+        <w:rPr>
+          <w:rFonts w:ascii="Arial" w:eastAsia="Times New Roman" w:hAnsi="Arial" w:cs="Arial"/>
+          <w:color w:val="000000"/>
+          <w:kern w:val="0"/>
+          <w:lang w:eastAsia="en-GB"/>
+          <w14:ligatures w14:val="none"/>
+        </w:rPr>
+        <w:t>/dehydration support; </w:t>
+      </w:r>
+    </w:p>
+    <w:p>
+      <w:pPr>
+        <w:numPr>
+          <w:ilvl w:val="0"/>
+          <w:numId w:val="8"/>
+        </w:numPr>
+        <w:spacing w:line="240" w:lineRule="auto"/>
+        <w:textAlignment w:val="baseline"/>
+        <w:rPr>
+          <w:rFonts w:ascii="Arial" w:eastAsia="Times New Roman" w:hAnsi="Arial" w:cs="Arial"/>
+          <w:color w:val="000000"/>
+          <w:kern w:val="0"/>
+          <w:lang w:eastAsia="en-GB"/>
+          <w14:ligatures w14:val="none"/>
+        </w:rPr>
+      </w:pPr>
+      <w:r>
+        <w:rPr>
+          <w:rFonts w:ascii="Arial" w:eastAsia="Times New Roman" w:hAnsi="Arial" w:cs="Arial"/>
+          <w:color w:val="000000"/>
+          <w:kern w:val="0"/>
+          <w:lang w:eastAsia="en-GB"/>
+          <w14:ligatures w14:val="none"/>
+        </w:rPr>
+        <w:t>Stage: displays a hydration reminder between acts</w:t>
+      </w:r>
+    </w:p>
+    <w:p>
+      <w:pPr>
+        <w:spacing w:line="240" w:lineRule="auto"/>
+        <w:rPr>
+          <w:rFonts w:ascii="Arial" w:eastAsia="Times New Roman" w:hAnsi="Arial" w:cs="Arial"/>
+          <w:color w:val="000000"/>
+          <w:kern w:val="0"/>
+          <w:lang w:eastAsia="en-GB"/>
+          <w14:ligatures w14:val="none"/>
+        </w:rPr>
+      </w:pPr>
+      <w:r>
+        <w:rPr>
+          <w:rFonts w:ascii="Arial" w:eastAsia="Times New Roman" w:hAnsi="Arial" w:cs="Arial"/>
+          <w:b/>
+          <w:bCs/>
+          <w:color w:val="000000"/>
+          <w:kern w:val="0"/>
+          <w:lang w:eastAsia="en-GB"/>
+          <w14:ligatures w14:val="none"/>
+        </w:rPr>
+        <w:t xml:space="preserve">Why it doesn't create a god object: </w:t>
+      </w:r>
+      <w:r>
+        <w:rPr>
+          <w:rFonts w:ascii="Arial" w:eastAsia="Times New Roman" w:hAnsi="Arial" w:cs="Arial"/>
+          <w:color w:val="000000"/>
+          <w:kern w:val="0"/>
+          <w:lang w:eastAsia="en-GB"/>
+          <w14:ligatures w14:val="none"/>
+        </w:rPr>
+        <w:t xml:space="preserve">the new notice type only required adding one value to the </w:t>
+      </w:r>
+      <w:proofErr w:type="spellStart"/>
+      <w:r>
+        <w:rPr>
+          <w:rFonts w:ascii="Arial" w:eastAsia="Times New Roman" w:hAnsi="Arial" w:cs="Arial"/>
+          <w:color w:val="000000"/>
+          <w:kern w:val="0"/>
+          <w:lang w:eastAsia="en-GB"/>
+          <w14:ligatures w14:val="none"/>
+        </w:rPr>
+        <w:t>NoticeType</w:t>
+      </w:r>
+      <w:proofErr w:type="spellEnd"/>
+      <w:r>
+        <w:rPr>
+          <w:rFonts w:ascii="Arial" w:eastAsia="Times New Roman" w:hAnsi="Arial" w:cs="Arial"/>
+          <w:color w:val="000000"/>
+          <w:kern w:val="0"/>
+          <w:lang w:eastAsia="en-GB"/>
+          <w14:ligatures w14:val="none"/>
+        </w:rPr>
+        <w:t xml:space="preserve"> </w:t>
+      </w:r>
+      <w:proofErr w:type="spellStart"/>
+      <w:r>
+        <w:rPr>
+          <w:rFonts w:ascii="Arial" w:eastAsia="Times New Roman" w:hAnsi="Arial" w:cs="Arial"/>
+          <w:color w:val="000000"/>
+          <w:kern w:val="0"/>
+          <w:lang w:eastAsia="en-GB"/>
+          <w14:ligatures w14:val="none"/>
+        </w:rPr>
+        <w:t>enum</w:t>
+      </w:r>
+      <w:proofErr w:type="spellEnd"/>
+      <w:r>
+        <w:rPr>
+          <w:rFonts w:ascii="Arial" w:eastAsia="Times New Roman" w:hAnsi="Arial" w:cs="Arial"/>
+          <w:color w:val="000000"/>
+          <w:kern w:val="0"/>
+          <w:lang w:eastAsia="en-GB"/>
+          <w14:ligatures w14:val="none"/>
+        </w:rPr>
+        <w:t xml:space="preserve"> and one ‘case’ in each interested leaf's already-existing ‘update()’ switch. No central class had to learn about vendors, medical units, or stages to implement this, </w:t>
+      </w:r>
+      <w:proofErr w:type="spellStart"/>
+      <w:r>
+        <w:rPr>
+          <w:rFonts w:ascii="Arial" w:eastAsia="Times New Roman" w:hAnsi="Arial" w:cs="Arial"/>
+          <w:color w:val="000000"/>
+          <w:kern w:val="0"/>
+          <w:lang w:eastAsia="en-GB"/>
+          <w14:ligatures w14:val="none"/>
+        </w:rPr>
+        <w:t>EventControl</w:t>
+      </w:r>
+      <w:proofErr w:type="spellEnd"/>
+      <w:r>
+        <w:rPr>
+          <w:rFonts w:ascii="Arial" w:eastAsia="Times New Roman" w:hAnsi="Arial" w:cs="Arial"/>
+          <w:color w:val="000000"/>
+          <w:kern w:val="0"/>
+          <w:lang w:eastAsia="en-GB"/>
+          <w14:ligatures w14:val="none"/>
+        </w:rPr>
+        <w:t xml:space="preserve"> and </w:t>
+      </w:r>
+      <w:proofErr w:type="spellStart"/>
+      <w:r>
+        <w:rPr>
+          <w:rFonts w:ascii="Arial" w:eastAsia="Times New Roman" w:hAnsi="Arial" w:cs="Arial"/>
+          <w:color w:val="000000"/>
+          <w:kern w:val="0"/>
+          <w:lang w:eastAsia="en-GB"/>
+          <w14:ligatures w14:val="none"/>
+        </w:rPr>
+        <w:t>EventGroup</w:t>
+      </w:r>
+      <w:proofErr w:type="spellEnd"/>
+      <w:r>
+        <w:rPr>
+          <w:rFonts w:ascii="Arial" w:eastAsia="Times New Roman" w:hAnsi="Arial" w:cs="Arial"/>
+          <w:color w:val="000000"/>
+          <w:kern w:val="0"/>
+          <w:lang w:eastAsia="en-GB"/>
+          <w14:ligatures w14:val="none"/>
+        </w:rPr>
+        <w:t xml:space="preserve"> are completely unaware that hydration handling exists. The behaviour is entirely distributed to the leaves that care about it, which is exactly what the Observer collaboration is for.</w:t>
+      </w:r>
+    </w:p>
+    <w:p>
+      <w:pPr>
+        <w:spacing w:after="0" w:line="240" w:lineRule="auto"/>
+        <w:rPr>
+          <w:rFonts w:ascii="Arial" w:eastAsia="Times New Roman" w:hAnsi="Arial" w:cs="Arial"/>
+          <w:color w:val="000000"/>
+          <w:kern w:val="0"/>
+          <w:lang w:eastAsia="en-GB"/>
+          <w14:ligatures w14:val="none"/>
+        </w:rPr>
+      </w:pPr>
+    </w:p>
+    <w:p>
+      <w:pPr>
+        <w:spacing w:line="240" w:lineRule="auto"/>
+        <w:rPr>
+          <w:rFonts w:ascii="Arial" w:eastAsia="Times New Roman" w:hAnsi="Arial" w:cs="Arial"/>
+          <w:color w:val="000000"/>
+          <w:kern w:val="0"/>
+          <w:lang w:eastAsia="en-GB"/>
+          <w14:ligatures w14:val="none"/>
+        </w:rPr>
+      </w:pPr>
+      <w:r>
+        <w:rPr>
+          <w:rFonts w:ascii="Arial" w:eastAsia="Times New Roman" w:hAnsi="Arial" w:cs="Arial"/>
+          <w:color w:val="000000"/>
+          <w:kern w:val="0"/>
+          <w:lang w:eastAsia="en-GB"/>
+          <w14:ligatures w14:val="none"/>
+        </w:rPr>
+        <w:t>2. Capacity-threshold crowd management (CROWD_SURGE/Stage::</w:t>
+      </w:r>
+      <w:proofErr w:type="spellStart"/>
+      <w:r>
+        <w:rPr>
+          <w:rFonts w:ascii="Arial" w:eastAsia="Times New Roman" w:hAnsi="Arial" w:cs="Arial"/>
+          <w:color w:val="000000"/>
+          <w:kern w:val="0"/>
+          <w:lang w:eastAsia="en-GB"/>
+          <w14:ligatures w14:val="none"/>
+        </w:rPr>
+        <w:t>atCapacityThreshold</w:t>
+      </w:r>
+      <w:proofErr w:type="spellEnd"/>
+      <w:r>
+        <w:rPr>
+          <w:rFonts w:ascii="Arial" w:eastAsia="Times New Roman" w:hAnsi="Arial" w:cs="Arial"/>
+          <w:color w:val="000000"/>
+          <w:kern w:val="0"/>
+          <w:lang w:eastAsia="en-GB"/>
+          <w14:ligatures w14:val="none"/>
+        </w:rPr>
+        <w:t>): </w:t>
+      </w:r>
+    </w:p>
+    <w:p>
+      <w:pPr>
+        <w:numPr>
+          <w:ilvl w:val="0"/>
+          <w:numId w:val="9"/>
+        </w:numPr>
+        <w:spacing w:line="240" w:lineRule="auto"/>
+        <w:textAlignment w:val="baseline"/>
+        <w:rPr>
+          <w:rFonts w:ascii="Arial" w:eastAsia="Times New Roman" w:hAnsi="Arial" w:cs="Arial"/>
+          <w:color w:val="000000"/>
+          <w:kern w:val="0"/>
+          <w:lang w:eastAsia="en-GB"/>
+          <w14:ligatures w14:val="none"/>
+        </w:rPr>
+      </w:pPr>
+      <w:r>
+        <w:rPr>
+          <w:rFonts w:ascii="Arial" w:eastAsia="Times New Roman" w:hAnsi="Arial" w:cs="Arial"/>
+          <w:color w:val="000000"/>
+          <w:kern w:val="0"/>
+          <w:lang w:eastAsia="en-GB"/>
+          <w14:ligatures w14:val="none"/>
+        </w:rPr>
+        <w:t xml:space="preserve">Stage: tracks its own attendance and exposes </w:t>
+      </w:r>
+      <w:proofErr w:type="spellStart"/>
+      <w:r>
+        <w:rPr>
+          <w:rFonts w:ascii="Arial" w:eastAsia="Times New Roman" w:hAnsi="Arial" w:cs="Arial"/>
+          <w:color w:val="000000"/>
+          <w:kern w:val="0"/>
+          <w:lang w:eastAsia="en-GB"/>
+          <w14:ligatures w14:val="none"/>
+        </w:rPr>
+        <w:t>atCapacityThreshold</w:t>
+      </w:r>
+      <w:proofErr w:type="spellEnd"/>
+      <w:r>
+        <w:rPr>
+          <w:rFonts w:ascii="Arial" w:eastAsia="Times New Roman" w:hAnsi="Arial" w:cs="Arial"/>
+          <w:color w:val="000000"/>
+          <w:kern w:val="0"/>
+          <w:lang w:eastAsia="en-GB"/>
+          <w14:ligatures w14:val="none"/>
+        </w:rPr>
+        <w:t xml:space="preserve">(double fraction). main.cpp (the client) checks condition. If true, asks </w:t>
+      </w:r>
+      <w:proofErr w:type="spellStart"/>
+      <w:r>
+        <w:rPr>
+          <w:rFonts w:ascii="Arial" w:eastAsia="Times New Roman" w:hAnsi="Arial" w:cs="Arial"/>
+          <w:color w:val="000000"/>
+          <w:kern w:val="0"/>
+          <w:lang w:eastAsia="en-GB"/>
+          <w14:ligatures w14:val="none"/>
+        </w:rPr>
+        <w:t>EventControl</w:t>
+      </w:r>
+      <w:proofErr w:type="spellEnd"/>
+      <w:r>
+        <w:rPr>
+          <w:rFonts w:ascii="Arial" w:eastAsia="Times New Roman" w:hAnsi="Arial" w:cs="Arial"/>
+          <w:color w:val="000000"/>
+          <w:kern w:val="0"/>
+          <w:lang w:eastAsia="en-GB"/>
+          <w14:ligatures w14:val="none"/>
+        </w:rPr>
+        <w:t xml:space="preserve"> to issue a CAPACITY_ALERT. Interested leaves (Stage, </w:t>
+      </w:r>
+      <w:proofErr w:type="spellStart"/>
+      <w:r>
+        <w:rPr>
+          <w:rFonts w:ascii="Arial" w:eastAsia="Times New Roman" w:hAnsi="Arial" w:cs="Arial"/>
+          <w:color w:val="000000"/>
+          <w:kern w:val="0"/>
+          <w:lang w:eastAsia="en-GB"/>
+          <w14:ligatures w14:val="none"/>
+        </w:rPr>
+        <w:t>EntranceGate</w:t>
+      </w:r>
+      <w:proofErr w:type="spellEnd"/>
+      <w:r>
+        <w:rPr>
+          <w:rFonts w:ascii="Arial" w:eastAsia="Times New Roman" w:hAnsi="Arial" w:cs="Arial"/>
+          <w:color w:val="000000"/>
+          <w:kern w:val="0"/>
+          <w:lang w:eastAsia="en-GB"/>
+          <w14:ligatures w14:val="none"/>
+        </w:rPr>
+        <w:t xml:space="preserve">, </w:t>
+      </w:r>
+      <w:proofErr w:type="spellStart"/>
+      <w:r>
+        <w:rPr>
+          <w:rFonts w:ascii="Arial" w:eastAsia="Times New Roman" w:hAnsi="Arial" w:cs="Arial"/>
+          <w:color w:val="000000"/>
+          <w:kern w:val="0"/>
+          <w:lang w:eastAsia="en-GB"/>
+          <w14:ligatures w14:val="none"/>
+        </w:rPr>
+        <w:t>SecurityPost</w:t>
+      </w:r>
+      <w:proofErr w:type="spellEnd"/>
+      <w:r>
+        <w:rPr>
+          <w:rFonts w:ascii="Arial" w:eastAsia="Times New Roman" w:hAnsi="Arial" w:cs="Arial"/>
+          <w:color w:val="000000"/>
+          <w:kern w:val="0"/>
+          <w:lang w:eastAsia="en-GB"/>
+          <w14:ligatures w14:val="none"/>
+        </w:rPr>
+        <w:t>, vendors) each apply a different crowd-control response, pausing entry, redirecting flow, shortening queue footprints.</w:t>
+      </w:r>
+    </w:p>
+    <w:p>
+      <w:pPr>
+        <w:spacing w:line="240" w:lineRule="auto"/>
+        <w:rPr>
+          <w:rFonts w:ascii="Arial" w:eastAsia="Times New Roman" w:hAnsi="Arial" w:cs="Arial"/>
+          <w:color w:val="000000"/>
+          <w:kern w:val="0"/>
+          <w:lang w:eastAsia="en-GB"/>
+          <w14:ligatures w14:val="none"/>
+        </w:rPr>
+      </w:pPr>
+      <w:r>
+        <w:rPr>
+          <w:rFonts w:ascii="Arial" w:eastAsia="Times New Roman" w:hAnsi="Arial" w:cs="Arial"/>
+          <w:b/>
+          <w:bCs/>
+          <w:color w:val="000000"/>
+          <w:kern w:val="0"/>
+          <w:lang w:eastAsia="en-GB"/>
+          <w14:ligatures w14:val="none"/>
+        </w:rPr>
+        <w:t>Why it doesn't create a god object</w:t>
+      </w:r>
+      <w:r>
+        <w:rPr>
+          <w:rFonts w:ascii="Arial" w:eastAsia="Times New Roman" w:hAnsi="Arial" w:cs="Arial"/>
+          <w:color w:val="000000"/>
+          <w:kern w:val="0"/>
+          <w:lang w:eastAsia="en-GB"/>
+          <w14:ligatures w14:val="none"/>
+        </w:rPr>
+        <w:t xml:space="preserve">: the threshold check and the attendance state it depends on live inside `Stage` itself, not in </w:t>
+      </w:r>
+      <w:proofErr w:type="spellStart"/>
+      <w:r>
+        <w:rPr>
+          <w:rFonts w:ascii="Arial" w:eastAsia="Times New Roman" w:hAnsi="Arial" w:cs="Arial"/>
+          <w:color w:val="000000"/>
+          <w:kern w:val="0"/>
+          <w:lang w:eastAsia="en-GB"/>
+          <w14:ligatures w14:val="none"/>
+        </w:rPr>
+        <w:t>EventControl</w:t>
+      </w:r>
+      <w:proofErr w:type="spellEnd"/>
+      <w:r>
+        <w:rPr>
+          <w:rFonts w:ascii="Arial" w:eastAsia="Times New Roman" w:hAnsi="Arial" w:cs="Arial"/>
+          <w:color w:val="000000"/>
+          <w:kern w:val="0"/>
+          <w:lang w:eastAsia="en-GB"/>
+          <w14:ligatures w14:val="none"/>
+        </w:rPr>
+        <w:t xml:space="preserve"> or </w:t>
+      </w:r>
+      <w:proofErr w:type="spellStart"/>
+      <w:r>
+        <w:rPr>
+          <w:rFonts w:ascii="Arial" w:eastAsia="Times New Roman" w:hAnsi="Arial" w:cs="Arial"/>
+          <w:color w:val="000000"/>
+          <w:kern w:val="0"/>
+          <w:lang w:eastAsia="en-GB"/>
+          <w14:ligatures w14:val="none"/>
+        </w:rPr>
+        <w:t>EventGroup</w:t>
+      </w:r>
+      <w:proofErr w:type="spellEnd"/>
+      <w:r>
+        <w:rPr>
+          <w:rFonts w:ascii="Arial" w:eastAsia="Times New Roman" w:hAnsi="Arial" w:cs="Arial"/>
+          <w:color w:val="000000"/>
+          <w:kern w:val="0"/>
+          <w:lang w:eastAsia="en-GB"/>
+          <w14:ligatures w14:val="none"/>
+        </w:rPr>
+        <w:t xml:space="preserve">. </w:t>
+      </w:r>
+      <w:proofErr w:type="spellStart"/>
+      <w:r>
+        <w:rPr>
+          <w:rFonts w:ascii="Arial" w:eastAsia="Times New Roman" w:hAnsi="Arial" w:cs="Arial"/>
+          <w:color w:val="000000"/>
+          <w:kern w:val="0"/>
+          <w:lang w:eastAsia="en-GB"/>
+          <w14:ligatures w14:val="none"/>
+        </w:rPr>
+        <w:t>EventControl's</w:t>
+      </w:r>
+      <w:proofErr w:type="spellEnd"/>
+      <w:r>
+        <w:rPr>
+          <w:rFonts w:ascii="Arial" w:eastAsia="Times New Roman" w:hAnsi="Arial" w:cs="Arial"/>
+          <w:color w:val="000000"/>
+          <w:kern w:val="0"/>
+          <w:lang w:eastAsia="en-GB"/>
+          <w14:ligatures w14:val="none"/>
+        </w:rPr>
+        <w:t xml:space="preserve"> only role is to broadcast the notice it's given, it doesn't know what a "threshold" is or which object triggered it. Each responding leaf holds only the state relevant to its own reaction (</w:t>
+      </w:r>
+      <w:proofErr w:type="spellStart"/>
+      <w:r>
+        <w:rPr>
+          <w:rFonts w:ascii="Arial" w:eastAsia="Times New Roman" w:hAnsi="Arial" w:cs="Arial"/>
+          <w:color w:val="000000"/>
+          <w:kern w:val="0"/>
+          <w:lang w:eastAsia="en-GB"/>
+          <w14:ligatures w14:val="none"/>
+        </w:rPr>
+        <w:t>SecurityPost</w:t>
+      </w:r>
+      <w:proofErr w:type="spellEnd"/>
+      <w:r>
+        <w:rPr>
+          <w:rFonts w:ascii="Arial" w:eastAsia="Times New Roman" w:hAnsi="Arial" w:cs="Arial"/>
+          <w:color w:val="000000"/>
+          <w:kern w:val="0"/>
+          <w:lang w:eastAsia="en-GB"/>
+          <w14:ligatures w14:val="none"/>
+        </w:rPr>
+        <w:t>::</w:t>
+      </w:r>
+      <w:proofErr w:type="spellStart"/>
+      <w:r>
+        <w:rPr>
+          <w:rFonts w:ascii="Arial" w:eastAsia="Times New Roman" w:hAnsi="Arial" w:cs="Arial"/>
+          <w:color w:val="000000"/>
+          <w:kern w:val="0"/>
+          <w:lang w:eastAsia="en-GB"/>
+          <w14:ligatures w14:val="none"/>
+        </w:rPr>
+        <w:t>exitMode</w:t>
+      </w:r>
+      <w:proofErr w:type="spellEnd"/>
+      <w:r>
+        <w:rPr>
+          <w:rFonts w:ascii="Arial" w:eastAsia="Times New Roman" w:hAnsi="Arial" w:cs="Arial"/>
+          <w:color w:val="000000"/>
+          <w:kern w:val="0"/>
+          <w:lang w:eastAsia="en-GB"/>
+          <w14:ligatures w14:val="none"/>
+        </w:rPr>
+        <w:t xml:space="preserve">, </w:t>
+      </w:r>
+      <w:proofErr w:type="spellStart"/>
+      <w:r>
+        <w:rPr>
+          <w:rFonts w:ascii="Arial" w:eastAsia="Times New Roman" w:hAnsi="Arial" w:cs="Arial"/>
+          <w:color w:val="000000"/>
+          <w:kern w:val="0"/>
+          <w:lang w:eastAsia="en-GB"/>
+          <w14:ligatures w14:val="none"/>
+        </w:rPr>
+        <w:t>EntranceGate</w:t>
+      </w:r>
+      <w:proofErr w:type="spellEnd"/>
+      <w:r>
+        <w:rPr>
+          <w:rFonts w:ascii="Arial" w:eastAsia="Times New Roman" w:hAnsi="Arial" w:cs="Arial"/>
+          <w:color w:val="000000"/>
+          <w:kern w:val="0"/>
+          <w:lang w:eastAsia="en-GB"/>
+          <w14:ligatures w14:val="none"/>
+        </w:rPr>
+        <w:t>::admitting), so no single class accumulates capacity logic for the whole festival.</w:t>
+      </w:r>
+    </w:p>
+    <w:p>
+      <w:pPr>
+        <w:spacing w:after="240" w:line="240" w:lineRule="auto"/>
+        <w:rPr>
+          <w:rFonts w:ascii="Arial" w:eastAsia="Times New Roman" w:hAnsi="Arial" w:cs="Arial"/>
+          <w:kern w:val="0"/>
+          <w:lang w:eastAsia="en-GB"/>
+          <w14:ligatures w14:val="none"/>
+        </w:rPr>
+      </w:pPr>
+    </w:p>
+    <w:p>
+      <w:pPr>
+        <w:spacing w:after="0" w:line="240" w:lineRule="auto"/>
+        <w:rPr>
+          <w:rFonts w:ascii="Arial" w:eastAsia="Times New Roman" w:hAnsi="Arial" w:cs="Arial"/>
+          <w:kern w:val="0"/>
+          <w:lang w:eastAsia="en-GB"/>
+          <w14:ligatures w14:val="none"/>
+        </w:rPr>
+      </w:pPr>
+    </w:p>
+    <w:p>
+      <w:pPr>
+        <w:spacing w:line="240" w:lineRule="auto"/>
+        <w:rPr>
+          <w:rFonts w:ascii="Arial" w:eastAsia="Times New Roman" w:hAnsi="Arial" w:cs="Arial"/>
+          <w:color w:val="000000"/>
+          <w:kern w:val="0"/>
+          <w:lang w:eastAsia="en-GB"/>
+          <w14:ligatures w14:val="none"/>
+        </w:rPr>
+      </w:pPr>
+      <w:r>
+        <w:rPr>
+          <w:rFonts w:ascii="Arial" w:eastAsia="Times New Roman" w:hAnsi="Arial" w:cs="Arial"/>
+          <w:color w:val="000000"/>
+          <w:kern w:val="0"/>
+          <w:lang w:eastAsia="en-GB"/>
+          <w14:ligatures w14:val="none"/>
+        </w:rPr>
+        <w:t>3. Mobile unit reassignment (</w:t>
+      </w:r>
+      <w:proofErr w:type="spellStart"/>
+      <w:r>
+        <w:rPr>
+          <w:rFonts w:ascii="Arial" w:eastAsia="Times New Roman" w:hAnsi="Arial" w:cs="Arial"/>
+          <w:color w:val="000000"/>
+          <w:kern w:val="0"/>
+          <w:lang w:eastAsia="en-GB"/>
+          <w14:ligatures w14:val="none"/>
+        </w:rPr>
+        <w:t>CleaningTeam</w:t>
+      </w:r>
+      <w:proofErr w:type="spellEnd"/>
+      <w:r>
+        <w:rPr>
+          <w:rFonts w:ascii="Arial" w:eastAsia="Times New Roman" w:hAnsi="Arial" w:cs="Arial"/>
+          <w:color w:val="000000"/>
+          <w:kern w:val="0"/>
+          <w:lang w:eastAsia="en-GB"/>
+          <w14:ligatures w14:val="none"/>
+        </w:rPr>
+        <w:t xml:space="preserve"> and </w:t>
+      </w:r>
+      <w:proofErr w:type="spellStart"/>
+      <w:r>
+        <w:rPr>
+          <w:rFonts w:ascii="Arial" w:eastAsia="Times New Roman" w:hAnsi="Arial" w:cs="Arial"/>
+          <w:color w:val="000000"/>
+          <w:kern w:val="0"/>
+          <w:lang w:eastAsia="en-GB"/>
+          <w14:ligatures w14:val="none"/>
+        </w:rPr>
+        <w:t>EventGroup</w:t>
+      </w:r>
+      <w:proofErr w:type="spellEnd"/>
+      <w:r>
+        <w:rPr>
+          <w:rFonts w:ascii="Arial" w:eastAsia="Times New Roman" w:hAnsi="Arial" w:cs="Arial"/>
+          <w:color w:val="000000"/>
+          <w:kern w:val="0"/>
+          <w:lang w:eastAsia="en-GB"/>
+          <w14:ligatures w14:val="none"/>
+        </w:rPr>
+        <w:t>::</w:t>
+      </w:r>
+      <w:proofErr w:type="spellStart"/>
+      <w:r>
+        <w:rPr>
+          <w:rFonts w:ascii="Arial" w:eastAsia="Times New Roman" w:hAnsi="Arial" w:cs="Arial"/>
+          <w:color w:val="000000"/>
+          <w:kern w:val="0"/>
+          <w:lang w:eastAsia="en-GB"/>
+          <w14:ligatures w14:val="none"/>
+        </w:rPr>
+        <w:t>transferChild</w:t>
+      </w:r>
+      <w:proofErr w:type="spellEnd"/>
+      <w:r>
+        <w:rPr>
+          <w:rFonts w:ascii="Arial" w:eastAsia="Times New Roman" w:hAnsi="Arial" w:cs="Arial"/>
+          <w:color w:val="000000"/>
+          <w:kern w:val="0"/>
+          <w:lang w:eastAsia="en-GB"/>
+          <w14:ligatures w14:val="none"/>
+        </w:rPr>
+        <w:t>)</w:t>
+      </w:r>
+    </w:p>
+    <w:p>
+      <w:pPr>
+        <w:spacing w:line="240" w:lineRule="auto"/>
+        <w:rPr>
+          <w:rFonts w:ascii="Arial" w:eastAsia="Times New Roman" w:hAnsi="Arial" w:cs="Arial"/>
+          <w:color w:val="000000"/>
+          <w:kern w:val="0"/>
+          <w:lang w:eastAsia="en-GB"/>
+          <w14:ligatures w14:val="none"/>
+        </w:rPr>
+      </w:pPr>
+      <w:r>
+        <w:rPr>
+          <w:rFonts w:ascii="Arial" w:eastAsia="Times New Roman" w:hAnsi="Arial" w:cs="Arial"/>
+          <w:color w:val="000000"/>
+          <w:kern w:val="0"/>
+          <w:lang w:eastAsia="en-GB"/>
+          <w14:ligatures w14:val="none"/>
+        </w:rPr>
+        <w:t xml:space="preserve">- </w:t>
+      </w:r>
+      <w:proofErr w:type="spellStart"/>
+      <w:r>
+        <w:rPr>
+          <w:rFonts w:ascii="Arial" w:eastAsia="Times New Roman" w:hAnsi="Arial" w:cs="Arial"/>
+          <w:color w:val="000000"/>
+          <w:kern w:val="0"/>
+          <w:lang w:eastAsia="en-GB"/>
+          <w14:ligatures w14:val="none"/>
+        </w:rPr>
+        <w:t>CleaningTeam</w:t>
+      </w:r>
+      <w:proofErr w:type="spellEnd"/>
+      <w:r>
+        <w:rPr>
+          <w:rFonts w:ascii="Arial" w:eastAsia="Times New Roman" w:hAnsi="Arial" w:cs="Arial"/>
+          <w:color w:val="000000"/>
+          <w:kern w:val="0"/>
+          <w:lang w:eastAsia="en-GB"/>
+          <w14:ligatures w14:val="none"/>
+        </w:rPr>
+        <w:t xml:space="preserve"> can be moved between areas at runtime via </w:t>
+      </w:r>
+      <w:proofErr w:type="spellStart"/>
+      <w:r>
+        <w:rPr>
+          <w:rFonts w:ascii="Arial" w:eastAsia="Times New Roman" w:hAnsi="Arial" w:cs="Arial"/>
+          <w:color w:val="000000"/>
+          <w:kern w:val="0"/>
+          <w:lang w:eastAsia="en-GB"/>
+          <w14:ligatures w14:val="none"/>
+        </w:rPr>
+        <w:t>EventGroup</w:t>
+      </w:r>
+      <w:proofErr w:type="spellEnd"/>
+      <w:r>
+        <w:rPr>
+          <w:rFonts w:ascii="Arial" w:eastAsia="Times New Roman" w:hAnsi="Arial" w:cs="Arial"/>
+          <w:color w:val="000000"/>
+          <w:kern w:val="0"/>
+          <w:lang w:eastAsia="en-GB"/>
+          <w14:ligatures w14:val="none"/>
+        </w:rPr>
+        <w:t>::</w:t>
+      </w:r>
+      <w:proofErr w:type="spellStart"/>
+      <w:r>
+        <w:rPr>
+          <w:rFonts w:ascii="Arial" w:eastAsia="Times New Roman" w:hAnsi="Arial" w:cs="Arial"/>
+          <w:color w:val="000000"/>
+          <w:kern w:val="0"/>
+          <w:lang w:eastAsia="en-GB"/>
+          <w14:ligatures w14:val="none"/>
+        </w:rPr>
+        <w:t>transferChild</w:t>
+      </w:r>
+      <w:proofErr w:type="spellEnd"/>
+      <w:r>
+        <w:rPr>
+          <w:rFonts w:ascii="Arial" w:eastAsia="Times New Roman" w:hAnsi="Arial" w:cs="Arial"/>
+          <w:color w:val="000000"/>
+          <w:kern w:val="0"/>
+          <w:lang w:eastAsia="en-GB"/>
+          <w14:ligatures w14:val="none"/>
+        </w:rPr>
+        <w:t>(), which atomically updates both Composite ownership and Observer registration in one call, with rollback if the destination rejects the transfer.</w:t>
+      </w:r>
+    </w:p>
+    <w:p>
+      <w:pPr>
+        <w:spacing w:after="0" w:line="240" w:lineRule="auto"/>
+        <w:rPr>
+          <w:rFonts w:ascii="Arial" w:eastAsia="Times New Roman" w:hAnsi="Arial" w:cs="Arial"/>
+          <w:color w:val="000000"/>
+          <w:kern w:val="0"/>
+          <w:lang w:eastAsia="en-GB"/>
+          <w14:ligatures w14:val="none"/>
+        </w:rPr>
+      </w:pPr>
+    </w:p>
+    <w:p>
+      <w:pPr>
+        <w:spacing w:line="240" w:lineRule="auto"/>
+        <w:rPr>
+          <w:rFonts w:ascii="Arial" w:eastAsia="Times New Roman" w:hAnsi="Arial" w:cs="Arial"/>
+          <w:color w:val="000000"/>
+          <w:kern w:val="0"/>
+          <w:lang w:eastAsia="en-GB"/>
+          <w14:ligatures w14:val="none"/>
+        </w:rPr>
+      </w:pPr>
+      <w:r>
+        <w:rPr>
+          <w:rFonts w:ascii="Arial" w:eastAsia="Times New Roman" w:hAnsi="Arial" w:cs="Arial"/>
+          <w:b/>
+          <w:bCs/>
+          <w:color w:val="000000"/>
+          <w:kern w:val="0"/>
+          <w:lang w:eastAsia="en-GB"/>
+          <w14:ligatures w14:val="none"/>
+        </w:rPr>
+        <w:t>Why it doesn't create a god object:</w:t>
+      </w:r>
+      <w:r>
+        <w:rPr>
+          <w:rFonts w:ascii="Arial" w:eastAsia="Times New Roman" w:hAnsi="Arial" w:cs="Arial"/>
+          <w:color w:val="000000"/>
+          <w:kern w:val="0"/>
+          <w:lang w:eastAsia="en-GB"/>
+          <w14:ligatures w14:val="none"/>
+        </w:rPr>
+        <w:t> </w:t>
+      </w:r>
+    </w:p>
+    <w:p>
+      <w:pPr>
+        <w:spacing w:line="240" w:lineRule="auto"/>
+        <w:rPr>
+          <w:rFonts w:ascii="Arial" w:eastAsia="Times New Roman" w:hAnsi="Arial" w:cs="Arial"/>
+          <w:color w:val="000000"/>
+          <w:kern w:val="0"/>
+          <w:lang w:eastAsia="en-GB"/>
+          <w14:ligatures w14:val="none"/>
+        </w:rPr>
+      </w:pPr>
+      <w:r>
+        <w:rPr>
+          <w:rFonts w:ascii="Arial" w:eastAsia="Times New Roman" w:hAnsi="Arial" w:cs="Arial"/>
+          <w:color w:val="000000"/>
+          <w:kern w:val="0"/>
+          <w:lang w:eastAsia="en-GB"/>
+          <w14:ligatures w14:val="none"/>
+        </w:rPr>
+        <w:t xml:space="preserve">the transfer logic lives on </w:t>
+      </w:r>
+      <w:proofErr w:type="spellStart"/>
+      <w:r>
+        <w:rPr>
+          <w:rFonts w:ascii="Arial" w:eastAsia="Times New Roman" w:hAnsi="Arial" w:cs="Arial"/>
+          <w:color w:val="000000"/>
+          <w:kern w:val="0"/>
+          <w:lang w:eastAsia="en-GB"/>
+          <w14:ligatures w14:val="none"/>
+        </w:rPr>
+        <w:t>EventGroup</w:t>
+      </w:r>
+      <w:proofErr w:type="spellEnd"/>
+      <w:r>
+        <w:rPr>
+          <w:rFonts w:ascii="Arial" w:eastAsia="Times New Roman" w:hAnsi="Arial" w:cs="Arial"/>
+          <w:color w:val="000000"/>
+          <w:kern w:val="0"/>
+          <w:lang w:eastAsia="en-GB"/>
+          <w14:ligatures w14:val="none"/>
+        </w:rPr>
+        <w:t xml:space="preserve">, the class that already owns the Composite ownership list and the Observer registration list — rather than being implemented as external free-standing code in main.cpp that reaches into both groups' internals. </w:t>
+      </w:r>
+      <w:proofErr w:type="spellStart"/>
+      <w:r>
+        <w:rPr>
+          <w:rFonts w:ascii="Arial" w:eastAsia="Times New Roman" w:hAnsi="Arial" w:cs="Arial"/>
+          <w:color w:val="000000"/>
+          <w:kern w:val="0"/>
+          <w:lang w:eastAsia="en-GB"/>
+          <w14:ligatures w14:val="none"/>
+        </w:rPr>
+        <w:t>EventGroup</w:t>
+      </w:r>
+      <w:proofErr w:type="spellEnd"/>
+      <w:r>
+        <w:rPr>
+          <w:rFonts w:ascii="Arial" w:eastAsia="Times New Roman" w:hAnsi="Arial" w:cs="Arial"/>
+          <w:color w:val="000000"/>
+          <w:kern w:val="0"/>
+          <w:lang w:eastAsia="en-GB"/>
+          <w14:ligatures w14:val="none"/>
+        </w:rPr>
+        <w:t xml:space="preserve"> doesn't need to know anything about </w:t>
+      </w:r>
+      <w:proofErr w:type="spellStart"/>
+      <w:r>
+        <w:rPr>
+          <w:rFonts w:ascii="Arial" w:eastAsia="Times New Roman" w:hAnsi="Arial" w:cs="Arial"/>
+          <w:color w:val="000000"/>
+          <w:kern w:val="0"/>
+          <w:lang w:eastAsia="en-GB"/>
+          <w14:ligatures w14:val="none"/>
+        </w:rPr>
+        <w:t>CleaningTeam</w:t>
+      </w:r>
+      <w:proofErr w:type="spellEnd"/>
+      <w:r>
+        <w:rPr>
+          <w:rFonts w:ascii="Arial" w:eastAsia="Times New Roman" w:hAnsi="Arial" w:cs="Arial"/>
+          <w:color w:val="000000"/>
+          <w:kern w:val="0"/>
+          <w:lang w:eastAsia="en-GB"/>
+          <w14:ligatures w14:val="none"/>
+        </w:rPr>
+        <w:t xml:space="preserve"> specifically; </w:t>
+      </w:r>
+      <w:proofErr w:type="spellStart"/>
+      <w:r>
+        <w:rPr>
+          <w:rFonts w:ascii="Arial" w:eastAsia="Times New Roman" w:hAnsi="Arial" w:cs="Arial"/>
+          <w:color w:val="000000"/>
+          <w:kern w:val="0"/>
+          <w:lang w:eastAsia="en-GB"/>
+          <w14:ligatures w14:val="none"/>
+        </w:rPr>
+        <w:t>transferChild</w:t>
+      </w:r>
+      <w:proofErr w:type="spellEnd"/>
+      <w:r>
+        <w:rPr>
+          <w:rFonts w:ascii="Arial" w:eastAsia="Times New Roman" w:hAnsi="Arial" w:cs="Arial"/>
+          <w:color w:val="000000"/>
+          <w:kern w:val="0"/>
+          <w:lang w:eastAsia="en-GB"/>
+          <w14:ligatures w14:val="none"/>
+        </w:rPr>
+        <w:t xml:space="preserve">() operates on the abstract </w:t>
+      </w:r>
+      <w:proofErr w:type="spellStart"/>
+      <w:r>
+        <w:rPr>
+          <w:rFonts w:ascii="Arial" w:eastAsia="Times New Roman" w:hAnsi="Arial" w:cs="Arial"/>
+          <w:color w:val="000000"/>
+          <w:kern w:val="0"/>
+          <w:lang w:eastAsia="en-GB"/>
+          <w14:ligatures w14:val="none"/>
+        </w:rPr>
+        <w:t>EventComponent</w:t>
+      </w:r>
+      <w:proofErr w:type="spellEnd"/>
+      <w:r>
+        <w:rPr>
+          <w:rFonts w:ascii="Arial" w:eastAsia="Times New Roman" w:hAnsi="Arial" w:cs="Arial"/>
+          <w:color w:val="000000"/>
+          <w:kern w:val="0"/>
+          <w:lang w:eastAsia="en-GB"/>
+          <w14:ligatures w14:val="none"/>
+        </w:rPr>
+        <w:t xml:space="preserve">*/Observer* interfaces, so the same method works for reassigning any leaf type without </w:t>
+      </w:r>
+      <w:proofErr w:type="spellStart"/>
+      <w:r>
+        <w:rPr>
+          <w:rFonts w:ascii="Arial" w:eastAsia="Times New Roman" w:hAnsi="Arial" w:cs="Arial"/>
+          <w:color w:val="000000"/>
+          <w:kern w:val="0"/>
+          <w:lang w:eastAsia="en-GB"/>
+          <w14:ligatures w14:val="none"/>
+        </w:rPr>
+        <w:t>EventGroup</w:t>
+      </w:r>
+      <w:proofErr w:type="spellEnd"/>
+      <w:r>
+        <w:rPr>
+          <w:rFonts w:ascii="Arial" w:eastAsia="Times New Roman" w:hAnsi="Arial" w:cs="Arial"/>
+          <w:color w:val="000000"/>
+          <w:kern w:val="0"/>
+          <w:lang w:eastAsia="en-GB"/>
+          <w14:ligatures w14:val="none"/>
+        </w:rPr>
+        <w:t xml:space="preserve"> growing type-specific logic for each one.</w:t>
+      </w:r>
+    </w:p>
+    <w:p>
+      <w:pPr>
+        <w:rPr>
+          <w:rFonts w:ascii="Arial" w:hAnsi="Arial" w:cs="Arial"/>
+          <w:color w:val="000000" w:themeColor="text1"/>
+          <w:lang w:val="en-US"/>
+        </w:rPr>
+      </w:pPr>
+    </w:p>
+    <w:p>
+      <w:pPr>
+        <w:rPr>
+          <w:rFonts w:ascii="Arial" w:hAnsi="Arial" w:cs="Arial"/>
+          <w:b/>
+          <w:bCs/>
+          <w:color w:val="000000" w:themeColor="text1"/>
+          <w:lang w:val="en-US"/>
+        </w:rPr>
+      </w:pPr>
+      <w:r>
+        <w:rPr>
+          <w:rFonts w:ascii="Arial" w:hAnsi="Arial" w:cs="Arial"/>
+          <w:b/>
+          <w:bCs/>
+          <w:color w:val="000000" w:themeColor="text1"/>
+          <w:lang w:val="en-US"/>
+        </w:rPr>
+        <w:t>Task 5:</w:t>
+      </w:r>
+      <w:r>
+        <w:rPr>
+          <w:rFonts w:ascii="Arial" w:hAnsi="Arial" w:cs="Arial"/>
+          <w:b/>
+          <w:bCs/>
+          <w:color w:val="000000" w:themeColor="text1"/>
+          <w:lang w:val="en-US"/>
+        </w:rPr>
+        <w:t xml:space="preserve"> (Shelby)</w:t>
+      </w:r>
+    </w:p>
+    <w:p>
+      <w:pPr>
+        <w:rPr>
+          <w:rFonts w:ascii="Arial" w:hAnsi="Arial" w:cs="Arial"/>
+          <w:color w:val="000000" w:themeColor="text1"/>
+          <w:lang w:val="en-US"/>
+        </w:rPr>
+      </w:pPr>
+      <w:r>
+        <w:rPr>
+          <w:rFonts w:ascii="Arial" w:hAnsi="Arial" w:cs="Arial"/>
+          <w:color w:val="000000" w:themeColor="text1"/>
+          <w:lang w:val="en-US"/>
+        </w:rPr>
+        <w:t>Attached separately.</w:t>
+      </w:r>
+    </w:p>
+    <w:p>
+      <w:pPr>
+        <w:rPr>
+          <w:rFonts w:ascii="Arial" w:hAnsi="Arial" w:cs="Arial"/>
+          <w:color w:val="000000" w:themeColor="text1"/>
+          <w:lang w:val="en-US"/>
+        </w:rPr>
+      </w:pPr>
+    </w:p>
+    <w:p>
+      <w:pPr>
+        <w:rPr>
+          <w:rFonts w:ascii="Arial" w:hAnsi="Arial" w:cs="Arial"/>
+          <w:b/>
+          <w:bCs/>
+          <w:color w:val="000000" w:themeColor="text1"/>
+          <w:lang w:val="en-US"/>
+        </w:rPr>
+      </w:pPr>
+      <w:r>
+        <w:rPr>
+          <w:rFonts w:ascii="Arial" w:hAnsi="Arial" w:cs="Arial"/>
+          <w:b/>
+          <w:bCs/>
+          <w:color w:val="000000" w:themeColor="text1"/>
+          <w:lang w:val="en-US"/>
+        </w:rPr>
+        <w:t>Task 7:</w:t>
+      </w:r>
+      <w:r>
+        <w:rPr>
+          <w:rFonts w:ascii="Arial" w:hAnsi="Arial" w:cs="Arial"/>
+          <w:b/>
+          <w:bCs/>
+          <w:color w:val="000000" w:themeColor="text1"/>
+          <w:lang w:val="en-US"/>
+        </w:rPr>
+        <w:t xml:space="preserve"> (Hannah)</w:t>
+      </w:r>
+    </w:p>
+    <w:p>
+      <w:pPr>
+        <w:pStyle w:val="pdq2pgselectionanchorcontainer"/>
+        <w:rPr>
+          <w:rFonts w:ascii="Arial" w:hAnsi="Arial" w:cs="Arial"/>
+          <w:color w:val="000000" w:themeColor="text1"/>
+        </w:rPr>
+      </w:pPr>
+      <w:r>
+        <w:rPr>
+          <w:rFonts w:ascii="Arial" w:hAnsi="Arial" w:cs="Arial"/>
+          <w:color w:val="000000" w:themeColor="text1"/>
+          <w:lang w:val="en-US"/>
+        </w:rPr>
+        <w:t xml:space="preserve">7.4) </w:t>
+      </w:r>
+      <w:r>
+        <w:rPr>
+          <w:rFonts w:ascii="Arial" w:hAnsi="Arial" w:cs="Arial"/>
+          <w:color w:val="000000" w:themeColor="text1"/>
+        </w:rPr>
+        <w:t xml:space="preserve">Our team divided the </w:t>
+      </w:r>
+      <w:proofErr w:type="spellStart"/>
+      <w:r>
+        <w:rPr>
+          <w:rFonts w:ascii="Arial" w:hAnsi="Arial" w:cs="Arial"/>
+          <w:color w:val="000000" w:themeColor="text1"/>
+        </w:rPr>
+        <w:t>EventFlow</w:t>
+      </w:r>
+      <w:proofErr w:type="spellEnd"/>
+      <w:r>
+        <w:rPr>
+          <w:rFonts w:ascii="Arial" w:hAnsi="Arial" w:cs="Arial"/>
+          <w:color w:val="000000" w:themeColor="text1"/>
+        </w:rPr>
+        <w:t xml:space="preserve"> practical so that each member had a clear primary responsibility while still reviewing and understanding the full system.</w:t>
+      </w:r>
+      <w:r>
+        <w:rPr>
+          <w:rStyle w:val="apple-converted-space"/>
+          <w:rFonts w:ascii="Arial" w:hAnsi="Arial" w:cs="Arial"/>
+          <w:color w:val="000000" w:themeColor="text1"/>
+        </w:rPr>
+        <w:t xml:space="preserve"> We split the work according to marks, each person got 100 marks to do. I ( Hannah) got tasks 1, 6,7,8. Kelly got assigned tasks 2,3,4 and Shelby got assigned task 5. This way each person had equal amounts of work to do. </w:t>
+      </w:r>
+    </w:p>
+    <w:p>
+      <w:pPr>
         <w:pStyle w:val="NormalWeb"/>
         <w:rPr>
           <w:rFonts w:ascii="Arial" w:hAnsi="Arial" w:cs="Arial"/>
@@ -3412,40 +5493,6 @@
           <w:color w:val="000000" w:themeColor="text1"/>
         </w:rPr>
         <w:t xml:space="preserve">. </w:t>
-      </w:r>
-    </w:p>
-    <w:p>
-      <w:pPr>
-        <w:rPr>
-          <w:rFonts w:ascii="Arial" w:hAnsi="Arial" w:cs="Arial"/>
-          <w:color w:val="000000" w:themeColor="text1"/>
-          <w:lang w:val="en-US"/>
-        </w:rPr>
-      </w:pPr>
-    </w:p>
-    <w:p>
-      <w:pPr>
-        <w:rPr>
-          <w:rFonts w:ascii="Arial" w:hAnsi="Arial" w:cs="Arial"/>
-          <w:color w:val="000000" w:themeColor="text1"/>
-          <w:lang w:val="en-US"/>
-        </w:rPr>
-      </w:pPr>
-      <w:r>
-        <w:rPr>
-          <w:rFonts w:ascii="Arial" w:hAnsi="Arial" w:cs="Arial"/>
-          <w:color w:val="000000" w:themeColor="text1"/>
-          <w:lang w:val="en-US"/>
-        </w:rPr>
-        <w:t>Task 8:</w:t>
-      </w:r>
-      <w:r>
-        <w:rPr>
-          <w:rFonts w:ascii="Arial" w:hAnsi="Arial" w:cs="Arial"/>
-          <w:color w:val="000000" w:themeColor="text1"/>
-          <w:lang w:val="en-US"/>
-        </w:rPr>
-        <w:t xml:space="preserve"> (Hannah)</w:t>
       </w:r>
     </w:p>
     <w:sectPr>
@@ -3461,9 +5508,9 @@
 <file path=word/numbering.xml><?xml version="1.0" encoding="utf-8"?>
 <w:numbering xmlns:wpc="http://schemas.microsoft.com/office/word/2010/wordprocessingCanvas" xmlns:cx="http://schemas.microsoft.com/office/drawing/2014/chartex" xmlns:cx1="http://schemas.microsoft.com/office/drawing/2015/9/8/chartex" xmlns:cx2="http://schemas.microsoft.com/office/drawing/2015/10/21/chartex" xmlns:cx3="http://schemas.microsoft.com/office/drawing/2016/5/9/chartex" xmlns:cx4="http://schemas.microsoft.com/office/drawing/2016/5/10/chartex" xmlns:cx5="http://schemas.microsoft.com/office/drawing/2016/5/11/chartex" xmlns:cx6="http://schemas.microsoft.com/office/drawing/2016/5/12/chartex" xmlns:cx7="http://schemas.microsoft.com/office/drawing/2016/5/13/chartex" xmlns:cx8="http://schemas.microsoft.com/office/drawing/2016/5/14/chartex" xmlns:mc="http://schemas.openxmlformats.org/markup-compatibility/2006" xmlns:m="http://schemas.openxmlformats.org/officeDocument/2006/math" xmlns:aink="http://schemas.microsoft.com/office/drawing/2016/ink" xmlns:am3d="http://schemas.microsoft.com/office/drawing/2017/model3d" xmlns:oel="http://schemas.microsoft.com/office/2019/extlst" xmlns:r="http://schemas.openxmlformats.org/officeDocument/2006/relationships" xmlns:wp14="http://schemas.microsoft.com/office/word/2010/wordprocessingDrawing" xmlns:wp="http://schemas.openxmlformats.org/drawingml/2006/wordprocessingDrawing" xmlns:wpg="http://schemas.microsoft.com/office/word/2010/wordprocessingGroup" xmlns:wpi="http://schemas.microsoft.com/office/word/2010/wordprocessingInk" xmlns:wps="http://schemas.microsoft.com/office/word/2010/wordprocessingShape" xmlns:o="urn:schemas-microsoft-com:office:office" xmlns:v="urn:schemas-microsoft-com:vml" xmlns:w10="urn:schemas-microsoft-com:office:word" xmlns:w="http://schemas.openxmlformats.org/wordprocessingml/2006/main" xmlns:w14="http://schemas.microsoft.com/office/word/2010/wordml" xmlns:w15="http://schemas.microsoft.com/office/word/2012/wordml" xmlns:w16cex="http://schemas.microsoft.com/office/word/2018/wordml/cex" xmlns:w16cid="http://schemas.microsoft.com/office/word/2016/wordml/cid" xmlns:w16="http://schemas.microsoft.com/office/word/2018/wordml" xmlns:w16sdtdh="http://schemas.microsoft.com/office/word/2020/wordml/sdtdatahash" xmlns:w16sdtfl="http://schemas.microsoft.com/office/word/2024/wordml/sdtformatlock" xmlns:w16se="http://schemas.microsoft.com/office/word/2015/wordml/symex" xmlns:w16du="http://schemas.microsoft.com/office/word/2023/wordml/word16du" xmlns:wne="http://schemas.microsoft.com/office/word/2006/wordml" mc:Ignorable="w14 w15 w16se w16cid w16 w16cex w16sdtdh w16sdtfl w16du wp14">
   <w:abstractNum w:abstractNumId="0" w15:restartNumberingAfterBreak="0">
-    <w:nsid w:val="07B85AD6"/>
+    <w:nsid w:val="059E2183"/>
     <w:multiLevelType w:val="multilevel"/>
-    <w:tmpl w:val="3176050A"/>
+    <w:tmpl w:val="C41023A2"/>
     <w:lvl w:ilvl="0">
       <w:start w:val="1"/>
       <w:numFmt w:val="bullet"/>
@@ -3610,9 +5657,9 @@
     </w:lvl>
   </w:abstractNum>
   <w:abstractNum w:abstractNumId="1" w15:restartNumberingAfterBreak="0">
-    <w:nsid w:val="125873B9"/>
+    <w:nsid w:val="07B85AD6"/>
     <w:multiLevelType w:val="multilevel"/>
-    <w:tmpl w:val="8D08FF78"/>
+    <w:tmpl w:val="3176050A"/>
     <w:lvl w:ilvl="0">
       <w:start w:val="1"/>
       <w:numFmt w:val="bullet"/>
@@ -3759,235 +5806,9 @@
     </w:lvl>
   </w:abstractNum>
   <w:abstractNum w:abstractNumId="2" w15:restartNumberingAfterBreak="0">
-    <w:nsid w:val="44663469"/>
+    <w:nsid w:val="125873B9"/>
     <w:multiLevelType w:val="multilevel"/>
-    <w:tmpl w:val="1D001182"/>
-    <w:lvl w:ilvl="0">
-      <w:start w:val="1"/>
-      <w:numFmt w:val="decimal"/>
-      <w:lvlText w:val="%1."/>
-      <w:lvlJc w:val="left"/>
-      <w:pPr>
-        <w:ind w:left="400" w:hanging="400"/>
-      </w:pPr>
-      <w:rPr>
-        <w:rFonts w:hint="default"/>
-      </w:rPr>
-    </w:lvl>
-    <w:lvl w:ilvl="1">
-      <w:start w:val="1"/>
-      <w:numFmt w:val="decimal"/>
-      <w:lvlText w:val="%1.%2)"/>
-      <w:lvlJc w:val="left"/>
-      <w:pPr>
-        <w:ind w:left="720" w:hanging="720"/>
-      </w:pPr>
-      <w:rPr>
-        <w:rFonts w:hint="default"/>
-      </w:rPr>
-    </w:lvl>
-    <w:lvl w:ilvl="2">
-      <w:start w:val="1"/>
-      <w:numFmt w:val="decimal"/>
-      <w:lvlText w:val="%1.%2)%3."/>
-      <w:lvlJc w:val="left"/>
-      <w:pPr>
-        <w:ind w:left="720" w:hanging="720"/>
-      </w:pPr>
-      <w:rPr>
-        <w:rFonts w:hint="default"/>
-      </w:rPr>
-    </w:lvl>
-    <w:lvl w:ilvl="3">
-      <w:start w:val="1"/>
-      <w:numFmt w:val="decimal"/>
-      <w:lvlText w:val="%1.%2)%3.%4."/>
-      <w:lvlJc w:val="left"/>
-      <w:pPr>
-        <w:ind w:left="1080" w:hanging="1080"/>
-      </w:pPr>
-      <w:rPr>
-        <w:rFonts w:hint="default"/>
-      </w:rPr>
-    </w:lvl>
-    <w:lvl w:ilvl="4">
-      <w:start w:val="1"/>
-      <w:numFmt w:val="decimal"/>
-      <w:lvlText w:val="%1.%2)%3.%4.%5."/>
-      <w:lvlJc w:val="left"/>
-      <w:pPr>
-        <w:ind w:left="1080" w:hanging="1080"/>
-      </w:pPr>
-      <w:rPr>
-        <w:rFonts w:hint="default"/>
-      </w:rPr>
-    </w:lvl>
-    <w:lvl w:ilvl="5">
-      <w:start w:val="1"/>
-      <w:numFmt w:val="decimal"/>
-      <w:lvlText w:val="%1.%2)%3.%4.%5.%6."/>
-      <w:lvlJc w:val="left"/>
-      <w:pPr>
-        <w:ind w:left="1440" w:hanging="1440"/>
-      </w:pPr>
-      <w:rPr>
-        <w:rFonts w:hint="default"/>
-      </w:rPr>
-    </w:lvl>
-    <w:lvl w:ilvl="6">
-      <w:start w:val="1"/>
-      <w:numFmt w:val="decimal"/>
-      <w:lvlText w:val="%1.%2)%3.%4.%5.%6.%7."/>
-      <w:lvlJc w:val="left"/>
-      <w:pPr>
-        <w:ind w:left="1440" w:hanging="1440"/>
-      </w:pPr>
-      <w:rPr>
-        <w:rFonts w:hint="default"/>
-      </w:rPr>
-    </w:lvl>
-    <w:lvl w:ilvl="7">
-      <w:start w:val="1"/>
-      <w:numFmt w:val="decimal"/>
-      <w:lvlText w:val="%1.%2)%3.%4.%5.%6.%7.%8."/>
-      <w:lvlJc w:val="left"/>
-      <w:pPr>
-        <w:ind w:left="1800" w:hanging="1800"/>
-      </w:pPr>
-      <w:rPr>
-        <w:rFonts w:hint="default"/>
-      </w:rPr>
-    </w:lvl>
-    <w:lvl w:ilvl="8">
-      <w:start w:val="1"/>
-      <w:numFmt w:val="decimal"/>
-      <w:lvlText w:val="%1.%2)%3.%4.%5.%6.%7.%8.%9."/>
-      <w:lvlJc w:val="left"/>
-      <w:pPr>
-        <w:ind w:left="1800" w:hanging="1800"/>
-      </w:pPr>
-      <w:rPr>
-        <w:rFonts w:hint="default"/>
-      </w:rPr>
-    </w:lvl>
-  </w:abstractNum>
-  <w:abstractNum w:abstractNumId="3" w15:restartNumberingAfterBreak="0">
-    <w:nsid w:val="49F87916"/>
-    <w:multiLevelType w:val="multilevel"/>
-    <w:tmpl w:val="20107488"/>
-    <w:lvl w:ilvl="0">
-      <w:start w:val="1"/>
-      <w:numFmt w:val="decimal"/>
-      <w:lvlText w:val="%1."/>
-      <w:lvlJc w:val="left"/>
-      <w:pPr>
-        <w:ind w:left="420" w:hanging="420"/>
-      </w:pPr>
-      <w:rPr>
-        <w:rFonts w:hint="default"/>
-      </w:rPr>
-    </w:lvl>
-    <w:lvl w:ilvl="1">
-      <w:start w:val="2"/>
-      <w:numFmt w:val="decimal"/>
-      <w:lvlText w:val="%1.%2)"/>
-      <w:lvlJc w:val="left"/>
-      <w:pPr>
-        <w:ind w:left="720" w:hanging="720"/>
-      </w:pPr>
-      <w:rPr>
-        <w:rFonts w:hint="default"/>
-      </w:rPr>
-    </w:lvl>
-    <w:lvl w:ilvl="2">
-      <w:start w:val="1"/>
-      <w:numFmt w:val="decimal"/>
-      <w:lvlText w:val="%1.%2)%3."/>
-      <w:lvlJc w:val="left"/>
-      <w:pPr>
-        <w:ind w:left="720" w:hanging="720"/>
-      </w:pPr>
-      <w:rPr>
-        <w:rFonts w:hint="default"/>
-      </w:rPr>
-    </w:lvl>
-    <w:lvl w:ilvl="3">
-      <w:start w:val="1"/>
-      <w:numFmt w:val="decimal"/>
-      <w:lvlText w:val="%1.%2)%3.%4."/>
-      <w:lvlJc w:val="left"/>
-      <w:pPr>
-        <w:ind w:left="1080" w:hanging="1080"/>
-      </w:pPr>
-      <w:rPr>
-        <w:rFonts w:hint="default"/>
-      </w:rPr>
-    </w:lvl>
-    <w:lvl w:ilvl="4">
-      <w:start w:val="1"/>
-      <w:numFmt w:val="decimal"/>
-      <w:lvlText w:val="%1.%2)%3.%4.%5."/>
-      <w:lvlJc w:val="left"/>
-      <w:pPr>
-        <w:ind w:left="1080" w:hanging="1080"/>
-      </w:pPr>
-      <w:rPr>
-        <w:rFonts w:hint="default"/>
-      </w:rPr>
-    </w:lvl>
-    <w:lvl w:ilvl="5">
-      <w:start w:val="1"/>
-      <w:numFmt w:val="decimal"/>
-      <w:lvlText w:val="%1.%2)%3.%4.%5.%6."/>
-      <w:lvlJc w:val="left"/>
-      <w:pPr>
-        <w:ind w:left="1440" w:hanging="1440"/>
-      </w:pPr>
-      <w:rPr>
-        <w:rFonts w:hint="default"/>
-      </w:rPr>
-    </w:lvl>
-    <w:lvl w:ilvl="6">
-      <w:start w:val="1"/>
-      <w:numFmt w:val="decimal"/>
-      <w:lvlText w:val="%1.%2)%3.%4.%5.%6.%7."/>
-      <w:lvlJc w:val="left"/>
-      <w:pPr>
-        <w:ind w:left="1440" w:hanging="1440"/>
-      </w:pPr>
-      <w:rPr>
-        <w:rFonts w:hint="default"/>
-      </w:rPr>
-    </w:lvl>
-    <w:lvl w:ilvl="7">
-      <w:start w:val="1"/>
-      <w:numFmt w:val="decimal"/>
-      <w:lvlText w:val="%1.%2)%3.%4.%5.%6.%7.%8."/>
-      <w:lvlJc w:val="left"/>
-      <w:pPr>
-        <w:ind w:left="1800" w:hanging="1800"/>
-      </w:pPr>
-      <w:rPr>
-        <w:rFonts w:hint="default"/>
-      </w:rPr>
-    </w:lvl>
-    <w:lvl w:ilvl="8">
-      <w:start w:val="1"/>
-      <w:numFmt w:val="decimal"/>
-      <w:lvlText w:val="%1.%2)%3.%4.%5.%6.%7.%8.%9."/>
-      <w:lvlJc w:val="left"/>
-      <w:pPr>
-        <w:ind w:left="2160" w:hanging="2160"/>
-      </w:pPr>
-      <w:rPr>
-        <w:rFonts w:hint="default"/>
-      </w:rPr>
-    </w:lvl>
-  </w:abstractNum>
-  <w:abstractNum w:abstractNumId="4" w15:restartNumberingAfterBreak="0">
-    <w:nsid w:val="6B335C69"/>
-    <w:multiLevelType w:val="multilevel"/>
-    <w:tmpl w:val="C9E8476E"/>
+    <w:tmpl w:val="8D08FF78"/>
     <w:lvl w:ilvl="0">
       <w:start w:val="1"/>
       <w:numFmt w:val="bullet"/>
@@ -4133,10 +5954,349 @@
       </w:rPr>
     </w:lvl>
   </w:abstractNum>
+  <w:abstractNum w:abstractNumId="3" w15:restartNumberingAfterBreak="0">
+    <w:nsid w:val="44663469"/>
+    <w:multiLevelType w:val="multilevel"/>
+    <w:tmpl w:val="1D001182"/>
+    <w:lvl w:ilvl="0">
+      <w:start w:val="1"/>
+      <w:numFmt w:val="decimal"/>
+      <w:lvlText w:val="%1."/>
+      <w:lvlJc w:val="left"/>
+      <w:pPr>
+        <w:ind w:left="400" w:hanging="400"/>
+      </w:pPr>
+      <w:rPr>
+        <w:rFonts w:hint="default"/>
+      </w:rPr>
+    </w:lvl>
+    <w:lvl w:ilvl="1">
+      <w:start w:val="1"/>
+      <w:numFmt w:val="decimal"/>
+      <w:lvlText w:val="%1.%2)"/>
+      <w:lvlJc w:val="left"/>
+      <w:pPr>
+        <w:ind w:left="720" w:hanging="720"/>
+      </w:pPr>
+      <w:rPr>
+        <w:rFonts w:hint="default"/>
+      </w:rPr>
+    </w:lvl>
+    <w:lvl w:ilvl="2">
+      <w:start w:val="1"/>
+      <w:numFmt w:val="decimal"/>
+      <w:lvlText w:val="%1.%2)%3."/>
+      <w:lvlJc w:val="left"/>
+      <w:pPr>
+        <w:ind w:left="720" w:hanging="720"/>
+      </w:pPr>
+      <w:rPr>
+        <w:rFonts w:hint="default"/>
+      </w:rPr>
+    </w:lvl>
+    <w:lvl w:ilvl="3">
+      <w:start w:val="1"/>
+      <w:numFmt w:val="decimal"/>
+      <w:lvlText w:val="%1.%2)%3.%4."/>
+      <w:lvlJc w:val="left"/>
+      <w:pPr>
+        <w:ind w:left="1080" w:hanging="1080"/>
+      </w:pPr>
+      <w:rPr>
+        <w:rFonts w:hint="default"/>
+      </w:rPr>
+    </w:lvl>
+    <w:lvl w:ilvl="4">
+      <w:start w:val="1"/>
+      <w:numFmt w:val="decimal"/>
+      <w:lvlText w:val="%1.%2)%3.%4.%5."/>
+      <w:lvlJc w:val="left"/>
+      <w:pPr>
+        <w:ind w:left="1080" w:hanging="1080"/>
+      </w:pPr>
+      <w:rPr>
+        <w:rFonts w:hint="default"/>
+      </w:rPr>
+    </w:lvl>
+    <w:lvl w:ilvl="5">
+      <w:start w:val="1"/>
+      <w:numFmt w:val="decimal"/>
+      <w:lvlText w:val="%1.%2)%3.%4.%5.%6."/>
+      <w:lvlJc w:val="left"/>
+      <w:pPr>
+        <w:ind w:left="1440" w:hanging="1440"/>
+      </w:pPr>
+      <w:rPr>
+        <w:rFonts w:hint="default"/>
+      </w:rPr>
+    </w:lvl>
+    <w:lvl w:ilvl="6">
+      <w:start w:val="1"/>
+      <w:numFmt w:val="decimal"/>
+      <w:lvlText w:val="%1.%2)%3.%4.%5.%6.%7."/>
+      <w:lvlJc w:val="left"/>
+      <w:pPr>
+        <w:ind w:left="1440" w:hanging="1440"/>
+      </w:pPr>
+      <w:rPr>
+        <w:rFonts w:hint="default"/>
+      </w:rPr>
+    </w:lvl>
+    <w:lvl w:ilvl="7">
+      <w:start w:val="1"/>
+      <w:numFmt w:val="decimal"/>
+      <w:lvlText w:val="%1.%2)%3.%4.%5.%6.%7.%8."/>
+      <w:lvlJc w:val="left"/>
+      <w:pPr>
+        <w:ind w:left="1800" w:hanging="1800"/>
+      </w:pPr>
+      <w:rPr>
+        <w:rFonts w:hint="default"/>
+      </w:rPr>
+    </w:lvl>
+    <w:lvl w:ilvl="8">
+      <w:start w:val="1"/>
+      <w:numFmt w:val="decimal"/>
+      <w:lvlText w:val="%1.%2)%3.%4.%5.%6.%7.%8.%9."/>
+      <w:lvlJc w:val="left"/>
+      <w:pPr>
+        <w:ind w:left="1800" w:hanging="1800"/>
+      </w:pPr>
+      <w:rPr>
+        <w:rFonts w:hint="default"/>
+      </w:rPr>
+    </w:lvl>
+  </w:abstractNum>
+  <w:abstractNum w:abstractNumId="4" w15:restartNumberingAfterBreak="0">
+    <w:nsid w:val="474B4C67"/>
+    <w:multiLevelType w:val="multilevel"/>
+    <w:tmpl w:val="88720044"/>
+    <w:lvl w:ilvl="0">
+      <w:start w:val="1"/>
+      <w:numFmt w:val="decimal"/>
+      <w:lvlText w:val="%1."/>
+      <w:lvlJc w:val="left"/>
+      <w:pPr>
+        <w:tabs>
+          <w:tab w:val="num" w:pos="720"/>
+        </w:tabs>
+        <w:ind w:left="720" w:hanging="360"/>
+      </w:pPr>
+    </w:lvl>
+    <w:lvl w:ilvl="1" w:tentative="1">
+      <w:start w:val="1"/>
+      <w:numFmt w:val="decimal"/>
+      <w:lvlText w:val="%2."/>
+      <w:lvlJc w:val="left"/>
+      <w:pPr>
+        <w:tabs>
+          <w:tab w:val="num" w:pos="1440"/>
+        </w:tabs>
+        <w:ind w:left="1440" w:hanging="360"/>
+      </w:pPr>
+    </w:lvl>
+    <w:lvl w:ilvl="2" w:tentative="1">
+      <w:start w:val="1"/>
+      <w:numFmt w:val="decimal"/>
+      <w:lvlText w:val="%3."/>
+      <w:lvlJc w:val="left"/>
+      <w:pPr>
+        <w:tabs>
+          <w:tab w:val="num" w:pos="2160"/>
+        </w:tabs>
+        <w:ind w:left="2160" w:hanging="360"/>
+      </w:pPr>
+    </w:lvl>
+    <w:lvl w:ilvl="3" w:tentative="1">
+      <w:start w:val="1"/>
+      <w:numFmt w:val="decimal"/>
+      <w:lvlText w:val="%4."/>
+      <w:lvlJc w:val="left"/>
+      <w:pPr>
+        <w:tabs>
+          <w:tab w:val="num" w:pos="2880"/>
+        </w:tabs>
+        <w:ind w:left="2880" w:hanging="360"/>
+      </w:pPr>
+    </w:lvl>
+    <w:lvl w:ilvl="4" w:tentative="1">
+      <w:start w:val="1"/>
+      <w:numFmt w:val="decimal"/>
+      <w:lvlText w:val="%5."/>
+      <w:lvlJc w:val="left"/>
+      <w:pPr>
+        <w:tabs>
+          <w:tab w:val="num" w:pos="3600"/>
+        </w:tabs>
+        <w:ind w:left="3600" w:hanging="360"/>
+      </w:pPr>
+    </w:lvl>
+    <w:lvl w:ilvl="5" w:tentative="1">
+      <w:start w:val="1"/>
+      <w:numFmt w:val="decimal"/>
+      <w:lvlText w:val="%6."/>
+      <w:lvlJc w:val="left"/>
+      <w:pPr>
+        <w:tabs>
+          <w:tab w:val="num" w:pos="4320"/>
+        </w:tabs>
+        <w:ind w:left="4320" w:hanging="360"/>
+      </w:pPr>
+    </w:lvl>
+    <w:lvl w:ilvl="6" w:tentative="1">
+      <w:start w:val="1"/>
+      <w:numFmt w:val="decimal"/>
+      <w:lvlText w:val="%7."/>
+      <w:lvlJc w:val="left"/>
+      <w:pPr>
+        <w:tabs>
+          <w:tab w:val="num" w:pos="5040"/>
+        </w:tabs>
+        <w:ind w:left="5040" w:hanging="360"/>
+      </w:pPr>
+    </w:lvl>
+    <w:lvl w:ilvl="7" w:tentative="1">
+      <w:start w:val="1"/>
+      <w:numFmt w:val="decimal"/>
+      <w:lvlText w:val="%8."/>
+      <w:lvlJc w:val="left"/>
+      <w:pPr>
+        <w:tabs>
+          <w:tab w:val="num" w:pos="5760"/>
+        </w:tabs>
+        <w:ind w:left="5760" w:hanging="360"/>
+      </w:pPr>
+    </w:lvl>
+    <w:lvl w:ilvl="8" w:tentative="1">
+      <w:start w:val="1"/>
+      <w:numFmt w:val="decimal"/>
+      <w:lvlText w:val="%9."/>
+      <w:lvlJc w:val="left"/>
+      <w:pPr>
+        <w:tabs>
+          <w:tab w:val="num" w:pos="6480"/>
+        </w:tabs>
+        <w:ind w:left="6480" w:hanging="360"/>
+      </w:pPr>
+    </w:lvl>
+  </w:abstractNum>
   <w:abstractNum w:abstractNumId="5" w15:restartNumberingAfterBreak="0">
-    <w:nsid w:val="73357EE1"/>
+    <w:nsid w:val="49F87916"/>
     <w:multiLevelType w:val="multilevel"/>
-    <w:tmpl w:val="BCAA4914"/>
+    <w:tmpl w:val="20107488"/>
+    <w:lvl w:ilvl="0">
+      <w:start w:val="1"/>
+      <w:numFmt w:val="decimal"/>
+      <w:lvlText w:val="%1."/>
+      <w:lvlJc w:val="left"/>
+      <w:pPr>
+        <w:ind w:left="420" w:hanging="420"/>
+      </w:pPr>
+      <w:rPr>
+        <w:rFonts w:hint="default"/>
+      </w:rPr>
+    </w:lvl>
+    <w:lvl w:ilvl="1">
+      <w:start w:val="2"/>
+      <w:numFmt w:val="decimal"/>
+      <w:lvlText w:val="%1.%2)"/>
+      <w:lvlJc w:val="left"/>
+      <w:pPr>
+        <w:ind w:left="720" w:hanging="720"/>
+      </w:pPr>
+      <w:rPr>
+        <w:rFonts w:hint="default"/>
+      </w:rPr>
+    </w:lvl>
+    <w:lvl w:ilvl="2">
+      <w:start w:val="1"/>
+      <w:numFmt w:val="decimal"/>
+      <w:lvlText w:val="%1.%2)%3."/>
+      <w:lvlJc w:val="left"/>
+      <w:pPr>
+        <w:ind w:left="720" w:hanging="720"/>
+      </w:pPr>
+      <w:rPr>
+        <w:rFonts w:hint="default"/>
+      </w:rPr>
+    </w:lvl>
+    <w:lvl w:ilvl="3">
+      <w:start w:val="1"/>
+      <w:numFmt w:val="decimal"/>
+      <w:lvlText w:val="%1.%2)%3.%4."/>
+      <w:lvlJc w:val="left"/>
+      <w:pPr>
+        <w:ind w:left="1080" w:hanging="1080"/>
+      </w:pPr>
+      <w:rPr>
+        <w:rFonts w:hint="default"/>
+      </w:rPr>
+    </w:lvl>
+    <w:lvl w:ilvl="4">
+      <w:start w:val="1"/>
+      <w:numFmt w:val="decimal"/>
+      <w:lvlText w:val="%1.%2)%3.%4.%5."/>
+      <w:lvlJc w:val="left"/>
+      <w:pPr>
+        <w:ind w:left="1080" w:hanging="1080"/>
+      </w:pPr>
+      <w:rPr>
+        <w:rFonts w:hint="default"/>
+      </w:rPr>
+    </w:lvl>
+    <w:lvl w:ilvl="5">
+      <w:start w:val="1"/>
+      <w:numFmt w:val="decimal"/>
+      <w:lvlText w:val="%1.%2)%3.%4.%5.%6."/>
+      <w:lvlJc w:val="left"/>
+      <w:pPr>
+        <w:ind w:left="1440" w:hanging="1440"/>
+      </w:pPr>
+      <w:rPr>
+        <w:rFonts w:hint="default"/>
+      </w:rPr>
+    </w:lvl>
+    <w:lvl w:ilvl="6">
+      <w:start w:val="1"/>
+      <w:numFmt w:val="decimal"/>
+      <w:lvlText w:val="%1.%2)%3.%4.%5.%6.%7."/>
+      <w:lvlJc w:val="left"/>
+      <w:pPr>
+        <w:ind w:left="1440" w:hanging="1440"/>
+      </w:pPr>
+      <w:rPr>
+        <w:rFonts w:hint="default"/>
+      </w:rPr>
+    </w:lvl>
+    <w:lvl w:ilvl="7">
+      <w:start w:val="1"/>
+      <w:numFmt w:val="decimal"/>
+      <w:lvlText w:val="%1.%2)%3.%4.%5.%6.%7.%8."/>
+      <w:lvlJc w:val="left"/>
+      <w:pPr>
+        <w:ind w:left="1800" w:hanging="1800"/>
+      </w:pPr>
+      <w:rPr>
+        <w:rFonts w:hint="default"/>
+      </w:rPr>
+    </w:lvl>
+    <w:lvl w:ilvl="8">
+      <w:start w:val="1"/>
+      <w:numFmt w:val="decimal"/>
+      <w:lvlText w:val="%1.%2)%3.%4.%5.%6.%7.%8.%9."/>
+      <w:lvlJc w:val="left"/>
+      <w:pPr>
+        <w:ind w:left="2160" w:hanging="2160"/>
+      </w:pPr>
+      <w:rPr>
+        <w:rFonts w:hint="default"/>
+      </w:rPr>
+    </w:lvl>
+  </w:abstractNum>
+  <w:abstractNum w:abstractNumId="6" w15:restartNumberingAfterBreak="0">
+    <w:nsid w:val="4E4C7BCF"/>
+    <w:multiLevelType w:val="multilevel"/>
+    <w:tmpl w:val="1D78D420"/>
     <w:lvl w:ilvl="0">
       <w:start w:val="1"/>
       <w:numFmt w:val="bullet"/>
@@ -4282,23 +6442,330 @@
       </w:rPr>
     </w:lvl>
   </w:abstractNum>
+  <w:abstractNum w:abstractNumId="7" w15:restartNumberingAfterBreak="0">
+    <w:nsid w:val="6B335C69"/>
+    <w:multiLevelType w:val="multilevel"/>
+    <w:tmpl w:val="C9E8476E"/>
+    <w:lvl w:ilvl="0">
+      <w:start w:val="1"/>
+      <w:numFmt w:val="bullet"/>
+      <w:lvlText w:val=""/>
+      <w:lvlJc w:val="left"/>
+      <w:pPr>
+        <w:tabs>
+          <w:tab w:val="num" w:pos="720"/>
+        </w:tabs>
+        <w:ind w:left="720" w:hanging="360"/>
+      </w:pPr>
+      <w:rPr>
+        <w:rFonts w:ascii="Symbol" w:hAnsi="Symbol" w:hint="default"/>
+        <w:sz w:val="20"/>
+      </w:rPr>
+    </w:lvl>
+    <w:lvl w:ilvl="1" w:tentative="1">
+      <w:start w:val="1"/>
+      <w:numFmt w:val="bullet"/>
+      <w:lvlText w:val="o"/>
+      <w:lvlJc w:val="left"/>
+      <w:pPr>
+        <w:tabs>
+          <w:tab w:val="num" w:pos="1440"/>
+        </w:tabs>
+        <w:ind w:left="1440" w:hanging="360"/>
+      </w:pPr>
+      <w:rPr>
+        <w:rFonts w:ascii="Courier New" w:hAnsi="Courier New" w:hint="default"/>
+        <w:sz w:val="20"/>
+      </w:rPr>
+    </w:lvl>
+    <w:lvl w:ilvl="2" w:tentative="1">
+      <w:start w:val="1"/>
+      <w:numFmt w:val="bullet"/>
+      <w:lvlText w:val=""/>
+      <w:lvlJc w:val="left"/>
+      <w:pPr>
+        <w:tabs>
+          <w:tab w:val="num" w:pos="2160"/>
+        </w:tabs>
+        <w:ind w:left="2160" w:hanging="360"/>
+      </w:pPr>
+      <w:rPr>
+        <w:rFonts w:ascii="Wingdings" w:hAnsi="Wingdings" w:hint="default"/>
+        <w:sz w:val="20"/>
+      </w:rPr>
+    </w:lvl>
+    <w:lvl w:ilvl="3" w:tentative="1">
+      <w:start w:val="1"/>
+      <w:numFmt w:val="bullet"/>
+      <w:lvlText w:val=""/>
+      <w:lvlJc w:val="left"/>
+      <w:pPr>
+        <w:tabs>
+          <w:tab w:val="num" w:pos="2880"/>
+        </w:tabs>
+        <w:ind w:left="2880" w:hanging="360"/>
+      </w:pPr>
+      <w:rPr>
+        <w:rFonts w:ascii="Wingdings" w:hAnsi="Wingdings" w:hint="default"/>
+        <w:sz w:val="20"/>
+      </w:rPr>
+    </w:lvl>
+    <w:lvl w:ilvl="4" w:tentative="1">
+      <w:start w:val="1"/>
+      <w:numFmt w:val="bullet"/>
+      <w:lvlText w:val=""/>
+      <w:lvlJc w:val="left"/>
+      <w:pPr>
+        <w:tabs>
+          <w:tab w:val="num" w:pos="3600"/>
+        </w:tabs>
+        <w:ind w:left="3600" w:hanging="360"/>
+      </w:pPr>
+      <w:rPr>
+        <w:rFonts w:ascii="Wingdings" w:hAnsi="Wingdings" w:hint="default"/>
+        <w:sz w:val="20"/>
+      </w:rPr>
+    </w:lvl>
+    <w:lvl w:ilvl="5" w:tentative="1">
+      <w:start w:val="1"/>
+      <w:numFmt w:val="bullet"/>
+      <w:lvlText w:val=""/>
+      <w:lvlJc w:val="left"/>
+      <w:pPr>
+        <w:tabs>
+          <w:tab w:val="num" w:pos="4320"/>
+        </w:tabs>
+        <w:ind w:left="4320" w:hanging="360"/>
+      </w:pPr>
+      <w:rPr>
+        <w:rFonts w:ascii="Wingdings" w:hAnsi="Wingdings" w:hint="default"/>
+        <w:sz w:val="20"/>
+      </w:rPr>
+    </w:lvl>
+    <w:lvl w:ilvl="6" w:tentative="1">
+      <w:start w:val="1"/>
+      <w:numFmt w:val="bullet"/>
+      <w:lvlText w:val=""/>
+      <w:lvlJc w:val="left"/>
+      <w:pPr>
+        <w:tabs>
+          <w:tab w:val="num" w:pos="5040"/>
+        </w:tabs>
+        <w:ind w:left="5040" w:hanging="360"/>
+      </w:pPr>
+      <w:rPr>
+        <w:rFonts w:ascii="Wingdings" w:hAnsi="Wingdings" w:hint="default"/>
+        <w:sz w:val="20"/>
+      </w:rPr>
+    </w:lvl>
+    <w:lvl w:ilvl="7" w:tentative="1">
+      <w:start w:val="1"/>
+      <w:numFmt w:val="bullet"/>
+      <w:lvlText w:val=""/>
+      <w:lvlJc w:val="left"/>
+      <w:pPr>
+        <w:tabs>
+          <w:tab w:val="num" w:pos="5760"/>
+        </w:tabs>
+        <w:ind w:left="5760" w:hanging="360"/>
+      </w:pPr>
+      <w:rPr>
+        <w:rFonts w:ascii="Wingdings" w:hAnsi="Wingdings" w:hint="default"/>
+        <w:sz w:val="20"/>
+      </w:rPr>
+    </w:lvl>
+    <w:lvl w:ilvl="8" w:tentative="1">
+      <w:start w:val="1"/>
+      <w:numFmt w:val="bullet"/>
+      <w:lvlText w:val=""/>
+      <w:lvlJc w:val="left"/>
+      <w:pPr>
+        <w:tabs>
+          <w:tab w:val="num" w:pos="6480"/>
+        </w:tabs>
+        <w:ind w:left="6480" w:hanging="360"/>
+      </w:pPr>
+      <w:rPr>
+        <w:rFonts w:ascii="Wingdings" w:hAnsi="Wingdings" w:hint="default"/>
+        <w:sz w:val="20"/>
+      </w:rPr>
+    </w:lvl>
+  </w:abstractNum>
+  <w:abstractNum w:abstractNumId="8" w15:restartNumberingAfterBreak="0">
+    <w:nsid w:val="73357EE1"/>
+    <w:multiLevelType w:val="multilevel"/>
+    <w:tmpl w:val="BCAA4914"/>
+    <w:lvl w:ilvl="0">
+      <w:start w:val="1"/>
+      <w:numFmt w:val="bullet"/>
+      <w:lvlText w:val=""/>
+      <w:lvlJc w:val="left"/>
+      <w:pPr>
+        <w:tabs>
+          <w:tab w:val="num" w:pos="720"/>
+        </w:tabs>
+        <w:ind w:left="720" w:hanging="360"/>
+      </w:pPr>
+      <w:rPr>
+        <w:rFonts w:ascii="Symbol" w:hAnsi="Symbol" w:hint="default"/>
+        <w:sz w:val="20"/>
+      </w:rPr>
+    </w:lvl>
+    <w:lvl w:ilvl="1" w:tentative="1">
+      <w:start w:val="1"/>
+      <w:numFmt w:val="bullet"/>
+      <w:lvlText w:val="o"/>
+      <w:lvlJc w:val="left"/>
+      <w:pPr>
+        <w:tabs>
+          <w:tab w:val="num" w:pos="1440"/>
+        </w:tabs>
+        <w:ind w:left="1440" w:hanging="360"/>
+      </w:pPr>
+      <w:rPr>
+        <w:rFonts w:ascii="Courier New" w:hAnsi="Courier New" w:hint="default"/>
+        <w:sz w:val="20"/>
+      </w:rPr>
+    </w:lvl>
+    <w:lvl w:ilvl="2" w:tentative="1">
+      <w:start w:val="1"/>
+      <w:numFmt w:val="bullet"/>
+      <w:lvlText w:val=""/>
+      <w:lvlJc w:val="left"/>
+      <w:pPr>
+        <w:tabs>
+          <w:tab w:val="num" w:pos="2160"/>
+        </w:tabs>
+        <w:ind w:left="2160" w:hanging="360"/>
+      </w:pPr>
+      <w:rPr>
+        <w:rFonts w:ascii="Wingdings" w:hAnsi="Wingdings" w:hint="default"/>
+        <w:sz w:val="20"/>
+      </w:rPr>
+    </w:lvl>
+    <w:lvl w:ilvl="3" w:tentative="1">
+      <w:start w:val="1"/>
+      <w:numFmt w:val="bullet"/>
+      <w:lvlText w:val=""/>
+      <w:lvlJc w:val="left"/>
+      <w:pPr>
+        <w:tabs>
+          <w:tab w:val="num" w:pos="2880"/>
+        </w:tabs>
+        <w:ind w:left="2880" w:hanging="360"/>
+      </w:pPr>
+      <w:rPr>
+        <w:rFonts w:ascii="Wingdings" w:hAnsi="Wingdings" w:hint="default"/>
+        <w:sz w:val="20"/>
+      </w:rPr>
+    </w:lvl>
+    <w:lvl w:ilvl="4" w:tentative="1">
+      <w:start w:val="1"/>
+      <w:numFmt w:val="bullet"/>
+      <w:lvlText w:val=""/>
+      <w:lvlJc w:val="left"/>
+      <w:pPr>
+        <w:tabs>
+          <w:tab w:val="num" w:pos="3600"/>
+        </w:tabs>
+        <w:ind w:left="3600" w:hanging="360"/>
+      </w:pPr>
+      <w:rPr>
+        <w:rFonts w:ascii="Wingdings" w:hAnsi="Wingdings" w:hint="default"/>
+        <w:sz w:val="20"/>
+      </w:rPr>
+    </w:lvl>
+    <w:lvl w:ilvl="5" w:tentative="1">
+      <w:start w:val="1"/>
+      <w:numFmt w:val="bullet"/>
+      <w:lvlText w:val=""/>
+      <w:lvlJc w:val="left"/>
+      <w:pPr>
+        <w:tabs>
+          <w:tab w:val="num" w:pos="4320"/>
+        </w:tabs>
+        <w:ind w:left="4320" w:hanging="360"/>
+      </w:pPr>
+      <w:rPr>
+        <w:rFonts w:ascii="Wingdings" w:hAnsi="Wingdings" w:hint="default"/>
+        <w:sz w:val="20"/>
+      </w:rPr>
+    </w:lvl>
+    <w:lvl w:ilvl="6" w:tentative="1">
+      <w:start w:val="1"/>
+      <w:numFmt w:val="bullet"/>
+      <w:lvlText w:val=""/>
+      <w:lvlJc w:val="left"/>
+      <w:pPr>
+        <w:tabs>
+          <w:tab w:val="num" w:pos="5040"/>
+        </w:tabs>
+        <w:ind w:left="5040" w:hanging="360"/>
+      </w:pPr>
+      <w:rPr>
+        <w:rFonts w:ascii="Wingdings" w:hAnsi="Wingdings" w:hint="default"/>
+        <w:sz w:val="20"/>
+      </w:rPr>
+    </w:lvl>
+    <w:lvl w:ilvl="7" w:tentative="1">
+      <w:start w:val="1"/>
+      <w:numFmt w:val="bullet"/>
+      <w:lvlText w:val=""/>
+      <w:lvlJc w:val="left"/>
+      <w:pPr>
+        <w:tabs>
+          <w:tab w:val="num" w:pos="5760"/>
+        </w:tabs>
+        <w:ind w:left="5760" w:hanging="360"/>
+      </w:pPr>
+      <w:rPr>
+        <w:rFonts w:ascii="Wingdings" w:hAnsi="Wingdings" w:hint="default"/>
+        <w:sz w:val="20"/>
+      </w:rPr>
+    </w:lvl>
+    <w:lvl w:ilvl="8" w:tentative="1">
+      <w:start w:val="1"/>
+      <w:numFmt w:val="bullet"/>
+      <w:lvlText w:val=""/>
+      <w:lvlJc w:val="left"/>
+      <w:pPr>
+        <w:tabs>
+          <w:tab w:val="num" w:pos="6480"/>
+        </w:tabs>
+        <w:ind w:left="6480" w:hanging="360"/>
+      </w:pPr>
+      <w:rPr>
+        <w:rFonts w:ascii="Wingdings" w:hAnsi="Wingdings" w:hint="default"/>
+        <w:sz w:val="20"/>
+      </w:rPr>
+    </w:lvl>
+  </w:abstractNum>
   <w:num w:numId="1" w16cid:durableId="158035462">
+    <w:abstractNumId w:val="3"/>
+  </w:num>
+  <w:num w:numId="2" w16cid:durableId="1552764298">
+    <w:abstractNumId w:val="1"/>
+  </w:num>
+  <w:num w:numId="3" w16cid:durableId="1493453174">
+    <w:abstractNumId w:val="7"/>
+  </w:num>
+  <w:num w:numId="4" w16cid:durableId="819884188">
     <w:abstractNumId w:val="2"/>
   </w:num>
-  <w:num w:numId="2" w16cid:durableId="1552764298">
-    <w:abstractNumId w:val="0"/>
+  <w:num w:numId="5" w16cid:durableId="1873180265">
+    <w:abstractNumId w:val="8"/>
   </w:num>
-  <w:num w:numId="3" w16cid:durableId="1493453174">
+  <w:num w:numId="6" w16cid:durableId="353768680">
+    <w:abstractNumId w:val="5"/>
+  </w:num>
+  <w:num w:numId="7" w16cid:durableId="1171289004">
     <w:abstractNumId w:val="4"/>
   </w:num>
-  <w:num w:numId="4" w16cid:durableId="819884188">
-    <w:abstractNumId w:val="1"/>
+  <w:num w:numId="8" w16cid:durableId="878124206">
+    <w:abstractNumId w:val="6"/>
   </w:num>
-  <w:num w:numId="5" w16cid:durableId="1873180265">
-    <w:abstractNumId w:val="5"/>
-  </w:num>
-  <w:num w:numId="6" w16cid:durableId="353768680">
-    <w:abstractNumId w:val="3"/>
+  <w:num w:numId="9" w16cid:durableId="637225007">
+    <w:abstractNumId w:val="0"/>
   </w:num>
 </w:numbering>
 </file>
@@ -4711,18 +7178,21 @@
     <w:link w:val="Heading1Char"/>
     <w:uiPriority w:val="9"/>
     <w:qFormat/>
-    <w:rsid w:val="00CD4262"/>
+    <w:rsid w:val="00DA6C6F"/>
     <w:pPr>
       <w:keepNext/>
       <w:keepLines/>
       <w:spacing w:before="360" w:after="80"/>
+      <w:jc w:val="center"/>
       <w:outlineLvl w:val="0"/>
     </w:pPr>
     <w:rPr>
       <w:rFonts w:asciiTheme="majorHAnsi" w:eastAsiaTheme="majorEastAsia" w:hAnsiTheme="majorHAnsi" w:cstheme="majorBidi"/>
-      <w:color w:val="0F4761" w:themeColor="accent1" w:themeShade="BF"/>
+      <w:b/>
+      <w:color w:val="000000" w:themeColor="text1"/>
       <w:sz w:val="40"/>
       <w:szCs w:val="40"/>
+      <w:u w:val="single"/>
     </w:rPr>
   </w:style>
   <w:style w:type="paragraph" w:styleId="Heading2">
@@ -4934,12 +7404,14 @@
     <w:basedOn w:val="DefaultParagraphFont"/>
     <w:link w:val="Heading1"/>
     <w:uiPriority w:val="9"/>
-    <w:rsid w:val="00CD4262"/>
+    <w:rsid w:val="00DA6C6F"/>
     <w:rPr>
       <w:rFonts w:asciiTheme="majorHAnsi" w:eastAsiaTheme="majorEastAsia" w:hAnsiTheme="majorHAnsi" w:cstheme="majorBidi"/>
-      <w:color w:val="0F4761" w:themeColor="accent1" w:themeShade="BF"/>
+      <w:b/>
+      <w:color w:val="000000" w:themeColor="text1"/>
       <w:sz w:val="40"/>
       <w:szCs w:val="40"/>
+      <w:u w:val="single"/>
     </w:rPr>
   </w:style>
   <w:style w:type="character" w:customStyle="1" w:styleId="Heading2Char">

</xml_diff>